<commit_message>
docs: align thesis front matter with AGTU reference
</commit_message>
<xml_diff>
--- a/08_Записка/source/M10_шаблон_стиля_АГТУ.docx
+++ b/08_Записка/source/M10_шаблон_стиля_АГТУ.docx
@@ -2,13 +2,3773 @@
 <file path=word/document.xml><?xml version="1.0" encoding="utf-8"?>
 <w:document xmlns:wpc="http://schemas.microsoft.com/office/word/2010/wordprocessingCanvas" xmlns:mc="http://schemas.openxmlformats.org/markup-compatibility/2006" xmlns:o="urn:schemas-microsoft-com:office:office" xmlns:r="http://schemas.openxmlformats.org/officeDocument/2006/relationships" xmlns:m="http://schemas.openxmlformats.org/officeDocument/2006/math" xmlns:v="urn:schemas-microsoft-com:vml" xmlns:wp14="http://schemas.microsoft.com/office/word/2010/wordprocessingDrawing" xmlns:wp="http://schemas.openxmlformats.org/drawingml/2006/wordprocessingDrawing" xmlns:w="http://schemas.openxmlformats.org/wordprocessingml/2006/main" xmlns:w14="http://schemas.microsoft.com/office/word/2010/wordml" xmlns:w10="urn:schemas-microsoft-com:office:word" xmlns:w15="http://schemas.microsoft.com/office/word/2012/wordml" xmlns:wpg="http://schemas.microsoft.com/office/word/2010/wordprocessingGroup" xmlns:wpi="http://schemas.microsoft.com/office/word/2010/wordprocessingInk" xmlns:wne="http://schemas.microsoft.com/office/word/2006/wordml" xmlns:wps="http://schemas.microsoft.com/office/word/2010/wordprocessingShape" xmlns:wpsCustomData="http://www.wps.cn/officeDocument/2013/wpsCustomData" mc:Ignorable="w14 w15 wp14">
   <w:body>
+    <w:tbl>
+      <w:tblPr>
+        <w:tblStyle w:val="7"/>
+        <w:tblW w:w="0" w:type="auto"/>
+        <w:tblInd w:w="108" w:type="dxa"/>
+        <w:tblLayout w:type="fixed"/>
+        <w:tblCellMar>
+          <w:top w:w="0" w:type="dxa"/>
+          <w:left w:w="108" w:type="dxa"/>
+          <w:bottom w:w="0" w:type="dxa"/>
+          <w:right w:w="108" w:type="dxa"/>
+        </w:tblCellMar>
+      </w:tblPr>
+      <w:tblGrid>
+        <w:gridCol w:w="1923"/>
+        <w:gridCol w:w="3979"/>
+        <w:gridCol w:w="4018"/>
+      </w:tblGrid>
+      <w:tr>
+        <w:tblPrEx>
+          <w:tblCellMar>
+            <w:top w:w="0" w:type="dxa"/>
+            <w:left w:w="108" w:type="dxa"/>
+            <w:bottom w:w="0" w:type="dxa"/>
+            <w:right w:w="108" w:type="dxa"/>
+          </w:tblCellMar>
+        </w:tblPrEx>
+        <w:tc>
+          <w:tcPr>
+            <w:tcW w:w="1923" w:type="dxa"/>
+          </w:tcPr>
+          <w:p>
+            <w:pPr>
+              <w:widowControl w:val="0"/>
+              <w:jc w:val="left"/>
+              <w:rPr>
+                <w:rFonts w:ascii="Times New Roman" w:hAnsi="Times New Roman"/>
+                <w:bCs/>
+                <w:sz w:val="28"/>
+                <w:szCs w:val="28"/>
+              </w:rPr>
+            </w:pPr>
+            <w:r>
+              <w:rPr>
+                <w:rFonts w:ascii="Times New Roman" w:hAnsi="Times New Roman"/>
+                <w:bCs/>
+                <w:sz w:val="28"/>
+                <w:szCs w:val="28"/>
+                <w:lang w:eastAsia="ru-RU"/>
+              </w:rPr>
+              <w:drawing>
+                <wp:anchor distT="0" distB="0" distL="114300" distR="114300" simplePos="0" relativeHeight="251659264" behindDoc="0" locked="0" layoutInCell="1" allowOverlap="1">
+                  <wp:simplePos x="0" y="0"/>
+                  <wp:positionH relativeFrom="column">
+                    <wp:posOffset>3810</wp:posOffset>
+                  </wp:positionH>
+                  <wp:positionV relativeFrom="paragraph">
+                    <wp:posOffset>-158115</wp:posOffset>
+                  </wp:positionV>
+                  <wp:extent cx="1114425" cy="1076325"/>
+                  <wp:effectExtent l="0" t="0" r="0" b="0"/>
+                  <wp:wrapSquare wrapText="bothSides"/>
+                  <wp:docPr id="66" name="Рисунок 2" descr="лого для документов 2022"/>
+                  <wp:cNvGraphicFramePr>
+                    <a:graphicFrameLocks xmlns:a="http://schemas.openxmlformats.org/drawingml/2006/main" noChangeAspect="1"/>
+                  </wp:cNvGraphicFramePr>
+                  <a:graphic xmlns:a="http://schemas.openxmlformats.org/drawingml/2006/main">
+                    <a:graphicData uri="http://schemas.openxmlformats.org/drawingml/2006/picture">
+                      <pic:pic xmlns:pic="http://schemas.openxmlformats.org/drawingml/2006/picture">
+                        <pic:nvPicPr>
+                          <pic:cNvPr id="66" name="Рисунок 2" descr="лого для документов 2022"/>
+                          <pic:cNvPicPr>
+                            <a:picLocks noChangeAspect="1" noChangeArrowheads="1"/>
+                          </pic:cNvPicPr>
+                        </pic:nvPicPr>
+                        <pic:blipFill>
+                          <a:blip r:embed="rId6">
+                            <a:extLst>
+                              <a:ext uri="{28A0092B-C50C-407E-A947-70E740481C1C}">
+                                <a14:useLocalDpi xmlns:a14="http://schemas.microsoft.com/office/drawing/2010/main" val="0"/>
+                              </a:ext>
+                            </a:extLst>
+                          </a:blip>
+                          <a:srcRect/>
+                          <a:stretch>
+                            <a:fillRect/>
+                          </a:stretch>
+                        </pic:blipFill>
+                        <pic:spPr>
+                          <a:xfrm>
+                            <a:off x="0" y="0"/>
+                            <a:ext cx="1114425" cy="1076325"/>
+                          </a:xfrm>
+                          <a:prstGeom prst="rect">
+                            <a:avLst/>
+                          </a:prstGeom>
+                          <a:noFill/>
+                          <a:ln>
+                            <a:noFill/>
+                          </a:ln>
+                        </pic:spPr>
+                      </pic:pic>
+                    </a:graphicData>
+                  </a:graphic>
+                </wp:anchor>
+              </w:drawing>
+            </w:r>
+          </w:p>
+        </w:tc>
+        <w:tc>
+          <w:tcPr>
+            <w:tcW w:w="7997" w:type="dxa"/>
+            <w:gridSpan w:val="2"/>
+          </w:tcPr>
+          <w:p>
+            <w:pPr>
+              <w:ind w:left="96"/>
+              <w:jc w:val="center"/>
+              <w:rPr>
+                <w:rFonts w:ascii="Times New Roman" w:hAnsi="Times New Roman"/>
+                <w:b/>
+                <w:bCs/>
+                <w:i/>
+                <w:iCs/>
+                <w:sz w:val="24"/>
+              </w:rPr>
+            </w:pPr>
+            <w:r>
+              <w:rPr>
+                <w:rFonts w:ascii="Times New Roman" w:hAnsi="Times New Roman"/>
+                <w:b/>
+                <w:bCs/>
+                <w:i/>
+                <w:iCs/>
+                <w:sz w:val="24"/>
+              </w:rPr>
+              <w:t>Федеральное агентство по рыболовству</w:t>
+            </w:r>
+          </w:p>
+          <w:p>
+            <w:pPr>
+              <w:ind w:left="96"/>
+              <w:jc w:val="center"/>
+              <w:rPr>
+                <w:rFonts w:ascii="Times New Roman" w:hAnsi="Times New Roman"/>
+                <w:b/>
+                <w:bCs/>
+                <w:i/>
+                <w:iCs/>
+                <w:sz w:val="24"/>
+              </w:rPr>
+            </w:pPr>
+            <w:r>
+              <w:rPr>
+                <w:rFonts w:ascii="Times New Roman" w:hAnsi="Times New Roman"/>
+                <w:b/>
+                <w:bCs/>
+                <w:i/>
+                <w:iCs/>
+                <w:sz w:val="24"/>
+              </w:rPr>
+              <w:t>Федеральное государственное бюджетное образовательное</w:t>
+            </w:r>
+          </w:p>
+          <w:p>
+            <w:pPr>
+              <w:ind w:left="96"/>
+              <w:jc w:val="center"/>
+              <w:rPr>
+                <w:rFonts w:ascii="Times New Roman" w:hAnsi="Times New Roman"/>
+                <w:b/>
+                <w:bCs/>
+                <w:i/>
+                <w:iCs/>
+                <w:sz w:val="24"/>
+              </w:rPr>
+            </w:pPr>
+            <w:r>
+              <w:rPr>
+                <w:rFonts w:ascii="Times New Roman" w:hAnsi="Times New Roman"/>
+                <w:b/>
+                <w:bCs/>
+                <w:i/>
+                <w:iCs/>
+                <w:sz w:val="24"/>
+              </w:rPr>
+              <w:t>учреждение высшего образования</w:t>
+            </w:r>
+          </w:p>
+          <w:p>
+            <w:pPr>
+              <w:ind w:left="96"/>
+              <w:jc w:val="center"/>
+              <w:rPr>
+                <w:rFonts w:ascii="Times New Roman" w:hAnsi="Times New Roman"/>
+                <w:b/>
+                <w:bCs/>
+                <w:i/>
+                <w:iCs/>
+                <w:sz w:val="24"/>
+              </w:rPr>
+            </w:pPr>
+            <w:r>
+              <w:rPr>
+                <w:rFonts w:ascii="Times New Roman" w:hAnsi="Times New Roman"/>
+                <w:b/>
+                <w:bCs/>
+                <w:i/>
+                <w:iCs/>
+                <w:sz w:val="24"/>
+              </w:rPr>
+              <w:t>«Астраханский государственный технический университет»</w:t>
+            </w:r>
+          </w:p>
+          <w:p>
+            <w:pPr>
+              <w:shd w:val="clear" w:color="auto" w:fill="FFFFFF"/>
+              <w:ind w:left="96"/>
+              <w:jc w:val="center"/>
+              <w:rPr>
+                <w:rFonts w:ascii="Times New Roman" w:hAnsi="Times New Roman"/>
+                <w:b/>
+                <w:sz w:val="12"/>
+                <w:szCs w:val="12"/>
+              </w:rPr>
+            </w:pPr>
+            <w:r>
+              <w:rPr>
+                <w:rFonts w:ascii="Times New Roman" w:hAnsi="Times New Roman"/>
+                <w:b/>
+                <w:sz w:val="12"/>
+                <w:szCs w:val="12"/>
+              </w:rPr>
+              <w:t xml:space="preserve">Система менеджмента качества в области образования, воспитания, науки и инноваций сертифицирована </w:t>
+            </w:r>
+          </w:p>
+          <w:p>
+            <w:pPr>
+              <w:shd w:val="clear" w:color="auto" w:fill="FFFFFF"/>
+              <w:ind w:left="96"/>
+              <w:jc w:val="center"/>
+              <w:rPr>
+                <w:rFonts w:ascii="Times New Roman" w:hAnsi="Times New Roman"/>
+                <w:b/>
+                <w:sz w:val="12"/>
+                <w:szCs w:val="12"/>
+              </w:rPr>
+            </w:pPr>
+            <w:r>
+              <w:rPr>
+                <w:rFonts w:ascii="Times New Roman" w:hAnsi="Times New Roman"/>
+                <w:b/>
+                <w:sz w:val="12"/>
+                <w:szCs w:val="12"/>
+              </w:rPr>
+              <w:t>ООО «ДКС РУС» по международному стандарту ISO 9001:2015</w:t>
+            </w:r>
+          </w:p>
+          <w:p>
+            <w:pPr>
+              <w:widowControl w:val="0"/>
+              <w:ind w:left="96" w:firstLine="1164"/>
+              <w:jc w:val="center"/>
+              <w:rPr>
+                <w:rFonts w:ascii="Times New Roman" w:hAnsi="Times New Roman"/>
+              </w:rPr>
+            </w:pPr>
+            <w:r>
+              <w:rPr>
+                <w:rFonts w:ascii="Times New Roman" w:hAnsi="Times New Roman"/>
+              </w:rPr>
+              <w:t xml:space="preserve"> </w:t>
+            </w:r>
+          </w:p>
+          <w:p>
+            <w:pPr>
+              <w:widowControl w:val="0"/>
+              <w:jc w:val="center"/>
+              <w:rPr>
+                <w:rFonts w:ascii="Times New Roman" w:hAnsi="Times New Roman"/>
+                <w:bCs/>
+                <w:sz w:val="28"/>
+                <w:szCs w:val="28"/>
+              </w:rPr>
+            </w:pPr>
+          </w:p>
+        </w:tc>
+      </w:tr>
+      <w:tr>
+        <w:tblPrEx>
+          <w:tblCellMar>
+            <w:top w:w="0" w:type="dxa"/>
+            <w:left w:w="108" w:type="dxa"/>
+            <w:bottom w:w="0" w:type="dxa"/>
+            <w:right w:w="108" w:type="dxa"/>
+          </w:tblCellMar>
+        </w:tblPrEx>
+        <w:trPr>
+          <w:trHeight w:val="3455" w:hRule="exact"/>
+        </w:trPr>
+        <w:tc>
+          <w:tcPr>
+            <w:tcW w:w="9920" w:type="dxa"/>
+            <w:gridSpan w:val="3"/>
+          </w:tcPr>
+          <w:p>
+            <w:pPr>
+              <w:widowControl w:val="0"/>
+              <w:jc w:val="left"/>
+              <w:rPr>
+                <w:rFonts w:ascii="Times New Roman" w:hAnsi="Times New Roman"/>
+                <w:sz w:val="24"/>
+              </w:rPr>
+            </w:pPr>
+          </w:p>
+          <w:p>
+            <w:pPr>
+              <w:widowControl w:val="0"/>
+              <w:jc w:val="left"/>
+              <w:rPr>
+                <w:rFonts w:ascii="Times New Roman" w:hAnsi="Times New Roman"/>
+                <w:sz w:val="24"/>
+              </w:rPr>
+            </w:pPr>
+            <w:r>
+              <w:rPr>
+                <w:rFonts w:ascii="Times New Roman" w:hAnsi="Times New Roman"/>
+                <w:sz w:val="24"/>
+              </w:rPr>
+              <w:t>Институт информационных технологий и коммуникаций</w:t>
+            </w:r>
+          </w:p>
+          <w:p>
+            <w:pPr>
+              <w:widowControl w:val="0"/>
+              <w:jc w:val="left"/>
+              <w:rPr>
+                <w:rFonts w:ascii="Times New Roman" w:hAnsi="Times New Roman"/>
+                <w:sz w:val="24"/>
+              </w:rPr>
+            </w:pPr>
+            <w:r>
+              <w:rPr>
+                <w:rFonts w:ascii="Times New Roman" w:hAnsi="Times New Roman"/>
+                <w:sz w:val="24"/>
+              </w:rPr>
+              <w:t>Направление подготовки 09.03.01 «Информатика и вычислительная техника»</w:t>
+            </w:r>
+          </w:p>
+          <w:p>
+            <w:pPr>
+              <w:widowControl w:val="0"/>
+              <w:jc w:val="left"/>
+              <w:rPr>
+                <w:rFonts w:ascii="Times New Roman" w:hAnsi="Times New Roman"/>
+                <w:sz w:val="24"/>
+              </w:rPr>
+            </w:pPr>
+            <w:r>
+              <w:rPr>
+                <w:rFonts w:ascii="Times New Roman" w:hAnsi="Times New Roman"/>
+                <w:sz w:val="24"/>
+              </w:rPr>
+              <w:t>Профиль «Искусственный интеллект, робототехника и сенсорика»</w:t>
+            </w:r>
+          </w:p>
+          <w:p>
+            <w:pPr>
+              <w:widowControl w:val="0"/>
+              <w:jc w:val="left"/>
+              <w:rPr>
+                <w:rFonts w:ascii="Times New Roman" w:hAnsi="Times New Roman"/>
+                <w:sz w:val="24"/>
+              </w:rPr>
+            </w:pPr>
+            <w:r>
+              <w:rPr>
+                <w:rFonts w:ascii="Times New Roman" w:hAnsi="Times New Roman"/>
+                <w:sz w:val="24"/>
+              </w:rPr>
+              <w:t>Кафедра «Автоматизированные системы обработки информации и управления»</w:t>
+            </w:r>
+          </w:p>
+          <w:p>
+            <w:pPr>
+              <w:widowControl w:val="0"/>
+              <w:jc w:val="left"/>
+              <w:rPr>
+                <w:rFonts w:ascii="Times New Roman" w:hAnsi="Times New Roman"/>
+                <w:sz w:val="24"/>
+              </w:rPr>
+            </w:pPr>
+          </w:p>
+          <w:p>
+            <w:pPr>
+              <w:rPr>
+                <w:rFonts w:ascii="Times New Roman" w:hAnsi="Times New Roman"/>
+                <w:sz w:val="24"/>
+              </w:rPr>
+            </w:pPr>
+          </w:p>
+          <w:p>
+            <w:pPr>
+              <w:tabs>
+                <w:tab w:val="left" w:pos="3492"/>
+              </w:tabs>
+              <w:rPr>
+                <w:rFonts w:ascii="Times New Roman" w:hAnsi="Times New Roman"/>
+                <w:sz w:val="24"/>
+              </w:rPr>
+            </w:pPr>
+          </w:p>
+        </w:tc>
+      </w:tr>
+      <w:tr>
+        <w:tblPrEx>
+          <w:tblCellMar>
+            <w:top w:w="0" w:type="dxa"/>
+            <w:left w:w="108" w:type="dxa"/>
+            <w:bottom w:w="0" w:type="dxa"/>
+            <w:right w:w="108" w:type="dxa"/>
+          </w:tblCellMar>
+        </w:tblPrEx>
+        <w:trPr>
+          <w:trHeight w:val="1940" w:hRule="exact"/>
+        </w:trPr>
+        <w:tc>
+          <w:tcPr>
+            <w:tcW w:w="9920" w:type="dxa"/>
+            <w:gridSpan w:val="3"/>
+            <w:vAlign w:val="center"/>
+          </w:tcPr>
+          <w:p>
+            <w:pPr>
+              <w:widowControl w:val="0"/>
+              <w:jc w:val="center"/>
+              <w:rPr>
+                <w:rFonts w:ascii="Times New Roman" w:hAnsi="Times New Roman"/>
+                <w:b/>
+                <w:bCs/>
+                <w:sz w:val="40"/>
+                <w:szCs w:val="40"/>
+              </w:rPr>
+            </w:pPr>
+            <w:r>
+              <w:rPr>
+                <w:rFonts w:ascii="Times New Roman" w:hAnsi="Times New Roman"/>
+                <w:b/>
+                <w:bCs/>
+                <w:sz w:val="40"/>
+                <w:szCs w:val="40"/>
+              </w:rPr>
+              <w:t>КУРСОВОЙ ПРОЕКТ</w:t>
+            </w:r>
+          </w:p>
+          <w:p>
+            <w:pPr>
+              <w:widowControl w:val="0"/>
+              <w:jc w:val="center"/>
+              <w:rPr>
+                <w:rFonts w:ascii="Times New Roman" w:hAnsi="Times New Roman"/>
+                <w:b/>
+                <w:bCs/>
+                <w:sz w:val="40"/>
+                <w:szCs w:val="40"/>
+              </w:rPr>
+            </w:pPr>
+            <w:r>
+              <w:rPr>
+                <w:rFonts w:ascii="Times New Roman" w:hAnsi="Times New Roman"/>
+                <w:b/>
+                <w:bCs/>
+                <w:sz w:val="28"/>
+                <w:szCs w:val="40"/>
+              </w:rPr>
+              <w:t>Моделирование и симуляция робота-манипулятора,</w:t>
+            </w:r>
+          </w:p>
+          <w:p>
+            <w:pPr>
+              <w:widowControl w:val="0"/>
+              <w:jc w:val="center"/>
+              <w:rPr>
+                <w:rFonts w:ascii="Times New Roman" w:hAnsi="Times New Roman"/>
+                <w:b/>
+                <w:bCs/>
+                <w:sz w:val="40"/>
+                <w:szCs w:val="40"/>
+              </w:rPr>
+            </w:pPr>
+            <w:r>
+              <w:rPr>
+                <w:rFonts w:ascii="Times New Roman" w:hAnsi="Times New Roman"/>
+                <w:b/>
+                <w:sz w:val="28"/>
+                <w:szCs w:val="32"/>
+              </w:rPr>
+              <w:t>выполняющего задачу сортировки объектов по цвету</w:t>
+            </w:r>
+          </w:p>
+          <w:p>
+            <w:pPr>
+              <w:widowControl w:val="0"/>
+              <w:jc w:val="center"/>
+              <w:rPr>
+                <w:rFonts w:ascii="Times New Roman" w:hAnsi="Times New Roman"/>
+                <w:bCs/>
+                <w:sz w:val="24"/>
+              </w:rPr>
+            </w:pPr>
+            <w:r>
+              <w:rPr>
+                <w:rFonts w:ascii="Times New Roman" w:hAnsi="Times New Roman"/>
+                <w:bCs/>
+                <w:sz w:val="24"/>
+              </w:rPr>
+              <w:t>по дисциплине «Моделирование роботов»</w:t>
+            </w:r>
+          </w:p>
+          <w:p>
+            <w:pPr>
+              <w:widowControl w:val="0"/>
+              <w:jc w:val="left"/>
+              <w:rPr>
+                <w:rFonts w:ascii="Times New Roman" w:hAnsi="Times New Roman"/>
+                <w:bCs/>
+                <w:sz w:val="28"/>
+                <w:szCs w:val="28"/>
+              </w:rPr>
+            </w:pPr>
+          </w:p>
+        </w:tc>
+      </w:tr>
+      <w:tr>
+        <w:tblPrEx>
+          <w:tblCellMar>
+            <w:top w:w="0" w:type="dxa"/>
+            <w:left w:w="108" w:type="dxa"/>
+            <w:bottom w:w="0" w:type="dxa"/>
+            <w:right w:w="108" w:type="dxa"/>
+          </w:tblCellMar>
+        </w:tblPrEx>
+        <w:trPr>
+          <w:trHeight w:val="2531" w:hRule="exact"/>
+        </w:trPr>
+        <w:tc>
+          <w:tcPr>
+            <w:tcW w:w="5902" w:type="dxa"/>
+            <w:gridSpan w:val="2"/>
+          </w:tcPr>
+          <w:p>
+            <w:pPr>
+              <w:widowControl w:val="0"/>
+              <w:spacing w:after="100"/>
+              <w:jc w:val="left"/>
+              <w:rPr>
+                <w:rFonts w:ascii="Times New Roman" w:hAnsi="Times New Roman"/>
+                <w:bCs/>
+                <w:sz w:val="24"/>
+              </w:rPr>
+            </w:pPr>
+            <w:r>
+              <w:rPr>
+                <w:rFonts w:ascii="Times New Roman" w:hAnsi="Times New Roman"/>
+                <w:bCs/>
+                <w:sz w:val="24"/>
+              </w:rPr>
+              <w:t xml:space="preserve">Допущен к защите </w:t>
+              <w:br/>
+              <w:t>«___» ______________20___г.</w:t>
+            </w:r>
+          </w:p>
+          <w:p>
+            <w:pPr>
+              <w:widowControl w:val="0"/>
+              <w:jc w:val="left"/>
+              <w:rPr>
+                <w:rFonts w:ascii="Times New Roman" w:hAnsi="Times New Roman"/>
+                <w:bCs/>
+                <w:sz w:val="24"/>
+              </w:rPr>
+            </w:pPr>
+            <w:r>
+              <w:rPr>
+                <w:rFonts w:ascii="Times New Roman" w:hAnsi="Times New Roman"/>
+                <w:bCs/>
+                <w:sz w:val="24"/>
+              </w:rPr>
+              <w:t xml:space="preserve">Руководитель </w:t>
+            </w:r>
+            <w:r>
+              <w:rPr>
+                <w:rFonts w:ascii="Times New Roman" w:hAnsi="Times New Roman"/>
+                <w:bCs/>
+                <w:sz w:val="24"/>
+              </w:rPr>
+              <w:br w:type="textWrapping"/>
+            </w:r>
+            <w:r>
+              <w:rPr>
+                <w:rFonts w:ascii="Times New Roman" w:hAnsi="Times New Roman"/>
+                <w:bCs/>
+                <w:sz w:val="24"/>
+              </w:rPr>
+              <w:t>__________________</w:t>
+            </w:r>
+            <w:r>
+              <w:rPr>
+                <w:rFonts w:ascii="Times New Roman" w:hAnsi="Times New Roman"/>
+                <w:bCs/>
+                <w:sz w:val="24"/>
+              </w:rPr>
+              <w:br w:type="textWrapping"/>
+            </w:r>
+          </w:p>
+          <w:p>
+            <w:pPr>
+              <w:widowControl w:val="0"/>
+              <w:spacing w:after="140"/>
+              <w:jc w:val="left"/>
+              <w:rPr>
+                <w:rFonts w:ascii="Times New Roman" w:hAnsi="Times New Roman"/>
+                <w:bCs/>
+                <w:sz w:val="24"/>
+              </w:rPr>
+            </w:pPr>
+            <w:r>
+              <w:rPr>
+                <w:rFonts w:ascii="Times New Roman" w:hAnsi="Times New Roman"/>
+                <w:bCs/>
+                <w:sz w:val="24"/>
+              </w:rPr>
+              <w:t>Оценка, полученная на защите</w:t>
+            </w:r>
+            <w:r>
+              <w:rPr>
+                <w:rFonts w:ascii="Times New Roman" w:hAnsi="Times New Roman"/>
+                <w:bCs/>
+                <w:sz w:val="24"/>
+              </w:rPr>
+              <w:br w:type="textWrapping"/>
+            </w:r>
+            <w:r>
+              <w:rPr>
+                <w:rFonts w:ascii="Times New Roman" w:hAnsi="Times New Roman"/>
+                <w:bCs/>
+                <w:sz w:val="24"/>
+              </w:rPr>
+              <w:t>«____________________»</w:t>
+            </w:r>
+          </w:p>
+          <w:p>
+            <w:pPr>
+              <w:widowControl w:val="0"/>
+              <w:jc w:val="left"/>
+              <w:rPr>
+                <w:rFonts w:ascii="Times New Roman" w:hAnsi="Times New Roman"/>
+                <w:bCs/>
+                <w:sz w:val="24"/>
+              </w:rPr>
+            </w:pPr>
+            <w:r>
+              <w:rPr>
+                <w:rFonts w:ascii="Times New Roman" w:hAnsi="Times New Roman"/>
+                <w:bCs/>
+                <w:sz w:val="24"/>
+              </w:rPr>
+              <w:t>Дата защиты: ______________</w:t>
+            </w:r>
+          </w:p>
+        </w:tc>
+        <w:tc>
+          <w:tcPr>
+            <w:tcW w:w="4018" w:type="dxa"/>
+          </w:tcPr>
+          <w:p>
+            <w:pPr>
+              <w:widowControl w:val="0"/>
+              <w:jc w:val="left"/>
+              <w:rPr>
+                <w:rFonts w:ascii="Times New Roman" w:hAnsi="Times New Roman"/>
+                <w:bCs/>
+                <w:sz w:val="24"/>
+              </w:rPr>
+            </w:pPr>
+            <w:r>
+              <w:rPr>
+                <w:rFonts w:ascii="Times New Roman" w:hAnsi="Times New Roman"/>
+                <w:bCs/>
+                <w:sz w:val="24"/>
+              </w:rPr>
+              <w:t>Шатуевым Р.С.</w:t>
+            </w:r>
+          </w:p>
+          <w:p>
+            <w:pPr>
+              <w:widowControl w:val="0"/>
+              <w:jc w:val="left"/>
+              <w:rPr>
+                <w:rFonts w:ascii="Times New Roman" w:hAnsi="Times New Roman"/>
+                <w:bCs/>
+                <w:sz w:val="24"/>
+              </w:rPr>
+            </w:pPr>
+            <w:r>
+              <w:rPr>
+                <w:rFonts w:ascii="Times New Roman" w:hAnsi="Times New Roman"/>
+                <w:bCs/>
+                <w:sz w:val="24"/>
+              </w:rPr>
+              <w:t>_______________________</w:t>
+            </w:r>
+          </w:p>
+          <w:p>
+            <w:pPr>
+              <w:widowControl w:val="0"/>
+              <w:jc w:val="left"/>
+              <w:rPr>
+                <w:rFonts w:ascii="Times New Roman" w:hAnsi="Times New Roman"/>
+                <w:bCs/>
+                <w:sz w:val="24"/>
+              </w:rPr>
+            </w:pPr>
+          </w:p>
+          <w:p>
+            <w:pPr>
+              <w:widowControl w:val="0"/>
+              <w:spacing w:after="100"/>
+              <w:jc w:val="left"/>
+              <w:rPr>
+                <w:rFonts w:ascii="Times New Roman" w:hAnsi="Times New Roman"/>
+                <w:bCs/>
+                <w:sz w:val="24"/>
+              </w:rPr>
+            </w:pPr>
+            <w:r>
+              <w:rPr>
+                <w:rFonts w:ascii="Times New Roman" w:hAnsi="Times New Roman"/>
+                <w:bCs/>
+                <w:sz w:val="24"/>
+              </w:rPr>
+              <w:t>Руководитель</w:t>
+              <w:br/>
+              <w:t>Кузнецова В.Ю.</w:t>
+            </w:r>
+          </w:p>
+          <w:p>
+            <w:pPr>
+              <w:widowControl w:val="0"/>
+              <w:jc w:val="left"/>
+              <w:rPr>
+                <w:rFonts w:ascii="Times New Roman" w:hAnsi="Times New Roman"/>
+                <w:bCs/>
+                <w:sz w:val="24"/>
+              </w:rPr>
+            </w:pPr>
+            <w:r>
+              <w:rPr>
+                <w:rFonts w:ascii="Times New Roman" w:hAnsi="Times New Roman"/>
+                <w:bCs/>
+                <w:sz w:val="24"/>
+              </w:rPr>
+              <w:t>___________________________</w:t>
+            </w:r>
+          </w:p>
+        </w:tc>
+      </w:tr>
+      <w:tr>
+        <w:tblPrEx>
+          <w:tblCellMar>
+            <w:top w:w="0" w:type="dxa"/>
+            <w:left w:w="108" w:type="dxa"/>
+            <w:bottom w:w="0" w:type="dxa"/>
+            <w:right w:w="108" w:type="dxa"/>
+          </w:tblCellMar>
+        </w:tblPrEx>
+        <w:trPr>
+          <w:trHeight w:val="2142" w:hRule="exact"/>
+        </w:trPr>
+        <w:tc>
+          <w:tcPr>
+            <w:tcW w:w="5902" w:type="dxa"/>
+            <w:gridSpan w:val="2"/>
+            <w:vAlign w:val="bottom"/>
+          </w:tcPr>
+          <w:p>
+            <w:pPr>
+              <w:widowControl w:val="0"/>
+              <w:spacing w:line="360" w:lineRule="auto"/>
+              <w:jc w:val="left"/>
+              <w:rPr>
+                <w:rFonts w:ascii="Times New Roman" w:hAnsi="Times New Roman"/>
+                <w:bCs/>
+                <w:sz w:val="24"/>
+              </w:rPr>
+            </w:pPr>
+            <w:r>
+              <w:rPr>
+                <w:rFonts w:ascii="Times New Roman" w:hAnsi="Times New Roman"/>
+                <w:bCs/>
+                <w:sz w:val="24"/>
+              </w:rPr>
+              <w:t>Члены комиссии:</w:t>
+            </w:r>
+          </w:p>
+          <w:p>
+            <w:pPr>
+              <w:widowControl w:val="0"/>
+              <w:spacing w:line="360" w:lineRule="auto"/>
+              <w:jc w:val="left"/>
+              <w:rPr>
+                <w:rFonts w:ascii="Times New Roman" w:hAnsi="Times New Roman"/>
+                <w:bCs/>
+                <w:sz w:val="24"/>
+              </w:rPr>
+            </w:pPr>
+            <w:r>
+              <w:rPr>
+                <w:rFonts w:ascii="Times New Roman" w:hAnsi="Times New Roman"/>
+                <w:bCs/>
+                <w:sz w:val="24"/>
+              </w:rPr>
+              <w:t>___________________ _______________</w:t>
+            </w:r>
+          </w:p>
+          <w:p>
+            <w:pPr>
+              <w:widowControl w:val="0"/>
+              <w:spacing w:line="360" w:lineRule="auto"/>
+              <w:jc w:val="left"/>
+              <w:rPr>
+                <w:rFonts w:ascii="Times New Roman" w:hAnsi="Times New Roman"/>
+                <w:bCs/>
+                <w:sz w:val="24"/>
+              </w:rPr>
+            </w:pPr>
+            <w:r>
+              <w:rPr>
+                <w:rFonts w:ascii="Times New Roman" w:hAnsi="Times New Roman"/>
+                <w:bCs/>
+                <w:sz w:val="24"/>
+              </w:rPr>
+              <w:t xml:space="preserve">___________________ </w:t>
+            </w:r>
+            <w:r>
+              <w:rPr>
+                <w:rFonts w:ascii="Times New Roman" w:hAnsi="Times New Roman"/>
+                <w:bCs/>
+                <w:sz w:val="24"/>
+                <w:u w:val="single"/>
+              </w:rPr>
+              <w:t>_______________</w:t>
+            </w:r>
+          </w:p>
+          <w:p>
+            <w:pPr>
+              <w:widowControl w:val="0"/>
+              <w:spacing w:line="360" w:lineRule="auto"/>
+              <w:jc w:val="left"/>
+              <w:rPr>
+                <w:rFonts w:ascii="Times New Roman" w:hAnsi="Times New Roman"/>
+                <w:bCs/>
+                <w:sz w:val="24"/>
+              </w:rPr>
+            </w:pPr>
+            <w:r>
+              <w:rPr>
+                <w:rFonts w:ascii="Times New Roman" w:hAnsi="Times New Roman"/>
+                <w:bCs/>
+                <w:sz w:val="24"/>
+              </w:rPr>
+              <w:t xml:space="preserve"> </w:t>
+            </w:r>
+          </w:p>
+        </w:tc>
+        <w:tc>
+          <w:tcPr>
+            <w:tcW w:w="4018" w:type="dxa"/>
+          </w:tcPr>
+          <w:p>
+            <w:pPr>
+              <w:widowControl w:val="0"/>
+              <w:jc w:val="left"/>
+              <w:rPr>
+                <w:rFonts w:ascii="Times New Roman" w:hAnsi="Times New Roman"/>
+                <w:bCs/>
+                <w:sz w:val="24"/>
+              </w:rPr>
+            </w:pPr>
+          </w:p>
+        </w:tc>
+      </w:tr>
+    </w:tbl>
+    <w:p>
+      <w:pPr>
+        <w:pStyle w:val="19"/>
+        <w:widowControl/>
+        <w:spacing w:before="700" w:line="360" w:lineRule="auto"/>
+        <w:ind w:right="0"/>
+        <w:rPr>
+          <w:caps/>
+          <w:szCs w:val="24"/>
+        </w:rPr>
+        <w:sectPr>
+          <w:headerReference r:id="rId3" w:type="even"/>
+          <w:pgSz w:w="11906" w:h="16838"/>
+          <w:pgMar w:top="1418" w:right="851" w:bottom="851" w:left="1134" w:header="567" w:footer="0" w:gutter="0"/>
+          <w:cols w:space="720" w:num="1"/>
+          <w:docGrid w:linePitch="360" w:charSpace="0"/>
+        </w:sectPr>
+      </w:pPr>
+      <w:r>
+        <w:rPr>
+          <w:bCs/>
+          <w:sz w:val="28"/>
+          <w:szCs w:val="28"/>
+        </w:rPr>
+        <w:t>Астрахань – 2026</w:t>
+      </w:r>
+    </w:p>
+    <w:p>
+      <w:pPr>
+        <w:jc w:val="center"/>
+        <w:rPr>
+          <w:rFonts w:ascii="Times New Roman" w:hAnsi="Times New Roman"/>
+          <w:b/>
+          <w:sz w:val="24"/>
+        </w:rPr>
+      </w:pPr>
+      <w:r>
+        <w:rPr>
+          <w:rFonts w:ascii="Times New Roman" w:hAnsi="Times New Roman"/>
+          <w:b/>
+          <w:sz w:val="22"/>
+        </w:rPr>
+        <w:t>ФЕДЕРАЛЬНОЕ АГЕНТСТВО РОССИЙСКОЙ ФЕДЕРАЦИИ ПО РЫБОЛОВСТВУ</w:t>
+      </w:r>
+    </w:p>
+    <w:p>
+      <w:pPr>
+        <w:jc w:val="center"/>
+        <w:rPr>
+          <w:rFonts w:ascii="Times New Roman" w:hAnsi="Times New Roman"/>
+          <w:b/>
+          <w:sz w:val="24"/>
+        </w:rPr>
+      </w:pPr>
+    </w:p>
+    <w:p>
+      <w:pPr>
+        <w:jc w:val="center"/>
+        <w:rPr>
+          <w:rFonts w:ascii="Times New Roman" w:hAnsi="Times New Roman"/>
+          <w:b/>
+          <w:sz w:val="24"/>
+          <w:lang w:val="en-US"/>
+        </w:rPr>
+      </w:pPr>
+      <w:r>
+        <w:rPr>
+          <w:rFonts w:ascii="Times New Roman" w:hAnsi="Times New Roman"/>
+          <w:b/>
+          <w:sz w:val="24"/>
+        </w:rPr>
+        <w:t>АСТРАХАНСКИЙ ГОСУДАРСТВЕННЫЙ ТЕХНИЧЕСКИЙ УНИВЕРСИТЕТ</w:t>
+      </w:r>
+    </w:p>
+    <w:p>
+      <w:pPr>
+        <w:jc w:val="center"/>
+        <w:rPr>
+          <w:rFonts w:ascii="Times New Roman" w:hAnsi="Times New Roman"/>
+          <w:b/>
+          <w:sz w:val="24"/>
+          <w:lang w:val="en-US"/>
+        </w:rPr>
+      </w:pPr>
+    </w:p>
+    <w:tbl>
+      <w:tblPr>
+        <w:tblStyle w:val="7"/>
+        <w:tblW w:w="0" w:type="auto"/>
+        <w:tblInd w:w="0" w:type="dxa"/>
+        <w:tblLayout w:type="fixed"/>
+        <w:tblCellMar>
+          <w:top w:w="0" w:type="dxa"/>
+          <w:left w:w="108" w:type="dxa"/>
+          <w:bottom w:w="0" w:type="dxa"/>
+          <w:right w:w="108" w:type="dxa"/>
+        </w:tblCellMar>
+      </w:tblPr>
+      <w:tblGrid>
+        <w:gridCol w:w="5396"/>
+        <w:gridCol w:w="4741"/>
+      </w:tblGrid>
+      <w:tr>
+        <w:tblPrEx>
+          <w:tblCellMar>
+            <w:top w:w="0" w:type="dxa"/>
+            <w:left w:w="108" w:type="dxa"/>
+            <w:bottom w:w="0" w:type="dxa"/>
+            <w:right w:w="108" w:type="dxa"/>
+          </w:tblCellMar>
+        </w:tblPrEx>
+        <w:tc>
+          <w:tcPr>
+            <w:tcW w:w="5396" w:type="dxa"/>
+          </w:tcPr>
+          <w:p>
+            <w:pPr>
+              <w:spacing w:line="360" w:lineRule="auto"/>
+              <w:rPr>
+                <w:rFonts w:ascii="Times New Roman" w:hAnsi="Times New Roman"/>
+                <w:sz w:val="24"/>
+                <w:lang w:val="en-US"/>
+              </w:rPr>
+            </w:pPr>
+            <w:r>
+              <w:rPr>
+                <w:rFonts w:ascii="Times New Roman" w:hAnsi="Times New Roman"/>
+                <w:b/>
+                <w:sz w:val="24"/>
+              </w:rPr>
+              <w:t>УТВЕРЖДАЮ</w:t>
+            </w:r>
+          </w:p>
+        </w:tc>
+        <w:tc>
+          <w:tcPr>
+            <w:tcW w:w="4741" w:type="dxa"/>
+            <w:vMerge w:val="restart"/>
+          </w:tcPr>
+          <w:p>
+            <w:pPr>
+              <w:spacing w:line="360" w:lineRule="auto"/>
+              <w:jc w:val="left"/>
+              <w:rPr>
+                <w:rFonts w:ascii="Times New Roman" w:hAnsi="Times New Roman"/>
+                <w:sz w:val="24"/>
+              </w:rPr>
+            </w:pPr>
+            <w:r>
+              <w:rPr>
+                <w:rFonts w:ascii="Times New Roman" w:hAnsi="Times New Roman"/>
+                <w:sz w:val="24"/>
+              </w:rPr>
+              <w:t>Кафедра</w:t>
+            </w:r>
+            <w:r>
+              <w:rPr>
+                <w:rFonts w:ascii="Times New Roman" w:hAnsi="Times New Roman"/>
+                <w:sz w:val="24"/>
+              </w:rPr>
+              <w:br w:type="textWrapping"/>
+            </w:r>
+            <w:r>
+              <w:rPr>
+                <w:rFonts w:ascii="Times New Roman" w:hAnsi="Times New Roman"/>
+                <w:sz w:val="24"/>
+              </w:rPr>
+              <w:t xml:space="preserve">«Автоматизированные системы </w:t>
+            </w:r>
+            <w:r>
+              <w:rPr>
+                <w:rFonts w:ascii="Times New Roman" w:hAnsi="Times New Roman"/>
+                <w:sz w:val="24"/>
+              </w:rPr>
+              <w:br w:type="textWrapping"/>
+            </w:r>
+            <w:r>
+              <w:rPr>
+                <w:rFonts w:ascii="Times New Roman" w:hAnsi="Times New Roman"/>
+                <w:sz w:val="24"/>
+              </w:rPr>
+              <w:t>обработки информации и управления»</w:t>
+            </w:r>
+          </w:p>
+        </w:tc>
+      </w:tr>
+      <w:tr>
+        <w:tblPrEx>
+          <w:tblCellMar>
+            <w:top w:w="0" w:type="dxa"/>
+            <w:left w:w="108" w:type="dxa"/>
+            <w:bottom w:w="0" w:type="dxa"/>
+            <w:right w:w="108" w:type="dxa"/>
+          </w:tblCellMar>
+        </w:tblPrEx>
+        <w:tc>
+          <w:tcPr>
+            <w:tcW w:w="5396" w:type="dxa"/>
+          </w:tcPr>
+          <w:p>
+            <w:pPr>
+              <w:pStyle w:val="87"/>
+            </w:pPr>
+            <w:r>
+              <w:t>Заведующий кафедрой</w:t>
+            </w:r>
+          </w:p>
+          <w:p>
+            <w:pPr>
+              <w:pStyle w:val="87"/>
+            </w:pPr>
+          </w:p>
+          <w:p>
+            <w:pPr>
+              <w:spacing w:line="360" w:lineRule="auto"/>
+              <w:rPr>
+                <w:rFonts w:ascii="Times New Roman" w:hAnsi="Times New Roman"/>
+                <w:sz w:val="24"/>
+              </w:rPr>
+            </w:pPr>
+            <w:r>
+              <w:rPr>
+                <w:rFonts w:ascii="Times New Roman" w:hAnsi="Times New Roman"/>
+                <w:sz w:val="24"/>
+              </w:rPr>
+              <w:t>______________________________</w:t>
+            </w:r>
+          </w:p>
+          <w:p>
+            <w:pPr>
+              <w:spacing w:line="360" w:lineRule="auto"/>
+              <w:rPr>
+                <w:rFonts w:ascii="Times New Roman" w:hAnsi="Times New Roman"/>
+                <w:sz w:val="24"/>
+              </w:rPr>
+            </w:pPr>
+            <w:r>
+              <w:rPr>
+                <w:rFonts w:ascii="Times New Roman" w:hAnsi="Times New Roman"/>
+                <w:sz w:val="24"/>
+              </w:rPr>
+              <w:t>«____»__________________20___ г.</w:t>
+            </w:r>
+          </w:p>
+        </w:tc>
+        <w:tc>
+          <w:tcPr>
+            <w:tcW w:w="4741" w:type="dxa"/>
+            <w:vMerge w:val="continue"/>
+          </w:tcPr>
+          <w:p>
+            <w:pPr>
+              <w:spacing w:line="360" w:lineRule="auto"/>
+              <w:rPr>
+                <w:rFonts w:ascii="Times New Roman" w:hAnsi="Times New Roman"/>
+                <w:sz w:val="24"/>
+              </w:rPr>
+            </w:pPr>
+          </w:p>
+        </w:tc>
+      </w:tr>
+    </w:tbl>
+    <w:p>
+      <w:pPr>
+        <w:spacing w:before="600"/>
+        <w:jc w:val="center"/>
+        <w:rPr>
+          <w:rFonts w:ascii="Times New Roman" w:hAnsi="Times New Roman"/>
+          <w:b/>
+          <w:sz w:val="24"/>
+        </w:rPr>
+      </w:pPr>
+      <w:r>
+        <w:rPr>
+          <w:rFonts w:ascii="Times New Roman" w:hAnsi="Times New Roman"/>
+          <w:b/>
+          <w:sz w:val="24"/>
+        </w:rPr>
+        <w:t>ЗАДАНИЕ</w:t>
+      </w:r>
+    </w:p>
+    <w:p>
+      <w:pPr>
+        <w:spacing w:before="120" w:after="240"/>
+        <w:jc w:val="center"/>
+        <w:rPr>
+          <w:rFonts w:ascii="Times New Roman" w:hAnsi="Times New Roman"/>
+          <w:b/>
+          <w:sz w:val="24"/>
+        </w:rPr>
+      </w:pPr>
+      <w:r>
+        <w:rPr>
+          <w:rFonts w:ascii="Times New Roman" w:hAnsi="Times New Roman"/>
+          <w:b/>
+          <w:sz w:val="24"/>
+        </w:rPr>
+        <w:t>на выполнение курсовой работы</w:t>
+      </w:r>
+    </w:p>
+    <w:p>
+      <w:pPr>
+        <w:tabs>
+          <w:tab w:val="left" w:pos="1589"/>
+        </w:tabs>
+        <w:spacing w:line="360" w:lineRule="auto"/>
+        <w:jc w:val="left"/>
+        <w:rPr>
+          <w:rFonts w:ascii="Times New Roman" w:hAnsi="Times New Roman"/>
+          <w:b/>
+          <w:i/>
+          <w:color w:val="000000"/>
+          <w:sz w:val="24"/>
+        </w:rPr>
+      </w:pPr>
+      <w:r>
+        <w:rPr>
+          <w:rFonts w:ascii="Times New Roman" w:hAnsi="Times New Roman"/>
+          <w:sz w:val="24"/>
+        </w:rPr>
+        <w:t>Обучающийся</w:t>
+      </w:r>
+      <w:r>
+        <w:rPr>
+          <w:rFonts w:ascii="Times New Roman" w:hAnsi="Times New Roman"/>
+          <w:sz w:val="24"/>
+        </w:rPr>
+        <w:tab/>
+      </w:r>
+      <w:r>
+        <w:rPr>
+          <w:rFonts w:ascii="Times New Roman" w:hAnsi="Times New Roman"/>
+          <w:b/>
+          <w:i/>
+          <w:color w:val="000000"/>
+          <w:sz w:val="24"/>
+        </w:rPr>
+        <w:t>Шатуев Р.С.</w:t>
+      </w:r>
+    </w:p>
+    <w:p>
+      <w:pPr>
+        <w:tabs>
+          <w:tab w:val="left" w:pos="1589"/>
+        </w:tabs>
+        <w:spacing w:line="360" w:lineRule="auto"/>
+        <w:jc w:val="left"/>
+        <w:rPr>
+          <w:rFonts w:ascii="Times New Roman" w:hAnsi="Times New Roman"/>
+          <w:b/>
+          <w:i/>
+          <w:sz w:val="24"/>
+        </w:rPr>
+      </w:pPr>
+      <w:r>
+        <w:rPr>
+          <w:rFonts w:ascii="Times New Roman" w:hAnsi="Times New Roman"/>
+          <w:sz w:val="24"/>
+        </w:rPr>
+        <w:t>Группа</w:t>
+      </w:r>
+      <w:r>
+        <w:rPr>
+          <w:rFonts w:ascii="Times New Roman" w:hAnsi="Times New Roman"/>
+          <w:sz w:val="24"/>
+        </w:rPr>
+        <w:tab/>
+      </w:r>
+      <w:r>
+        <w:rPr>
+          <w:rFonts w:ascii="Times New Roman" w:hAnsi="Times New Roman"/>
+          <w:b/>
+          <w:i/>
+          <w:sz w:val="24"/>
+        </w:rPr>
+        <w:t>ДИНРб-31</w:t>
+      </w:r>
+    </w:p>
+    <w:p>
+      <w:pPr>
+        <w:tabs>
+          <w:tab w:val="left" w:pos="1589"/>
+        </w:tabs>
+        <w:spacing w:line="360" w:lineRule="auto"/>
+        <w:jc w:val="left"/>
+        <w:rPr>
+          <w:rFonts w:ascii="Times New Roman" w:hAnsi="Times New Roman"/>
+          <w:b/>
+          <w:i/>
+          <w:sz w:val="24"/>
+        </w:rPr>
+      </w:pPr>
+      <w:r>
+        <w:rPr>
+          <w:rFonts w:ascii="Times New Roman" w:hAnsi="Times New Roman"/>
+          <w:sz w:val="24"/>
+        </w:rPr>
+        <w:t>Тема</w:t>
+      </w:r>
+      <w:r>
+        <w:rPr>
+          <w:rFonts w:ascii="Times New Roman" w:hAnsi="Times New Roman"/>
+          <w:sz w:val="24"/>
+        </w:rPr>
+        <w:tab/>
+      </w:r>
+      <w:r>
+        <w:rPr>
+          <w:rFonts w:ascii="Times New Roman" w:hAnsi="Times New Roman"/>
+          <w:b/>
+          <w:i/>
+          <w:sz w:val="24"/>
+        </w:rPr>
+        <w:t>Моделирование и симуляция робота-манипулятора, выполняющего задачу сортировки объектов по цвету</w:t>
+      </w:r>
+    </w:p>
+    <w:tbl>
+      <w:tblPr>
+        <w:tblStyle w:val="7"/>
+        <w:tblW w:w="9922" w:type="dxa"/>
+        <w:tblInd w:w="0" w:type="dxa"/>
+        <w:tblLayout w:type="fixed"/>
+        <w:tblCellMar>
+          <w:top w:w="0" w:type="dxa"/>
+          <w:left w:w="10" w:type="dxa"/>
+          <w:bottom w:w="0" w:type="dxa"/>
+          <w:right w:w="10" w:type="dxa"/>
+        </w:tblCellMar>
+      </w:tblPr>
+      <w:tblGrid>
+        <w:gridCol w:w="6811"/>
+        <w:gridCol w:w="3111"/>
+      </w:tblGrid>
+      <w:tr>
+        <w:tblPrEx>
+          <w:tblCellMar>
+            <w:top w:w="0" w:type="dxa"/>
+            <w:left w:w="10" w:type="dxa"/>
+            <w:bottom w:w="0" w:type="dxa"/>
+            <w:right w:w="10" w:type="dxa"/>
+          </w:tblCellMar>
+        </w:tblPrEx>
+        <w:tc>
+          <w:tcPr>
+            <w:tcW w:w="6811" w:type="dxa"/>
+            <w:tcMar>
+              <w:top w:w="0" w:type="dxa"/>
+              <w:left w:w="0" w:type="dxa"/>
+              <w:bottom w:w="0" w:type="dxa"/>
+              <w:right w:w="0" w:type="dxa"/>
+            </w:tcMar>
+          </w:tcPr>
+          <w:p>
+            <w:pPr>
+              <w:pStyle w:val="87"/>
+              <w:tabs>
+                <w:tab w:val="left" w:pos="5898"/>
+                <w:tab w:val="left" w:pos="6306"/>
+                <w:tab w:val="left" w:pos="6729"/>
+                <w:tab w:val="left" w:pos="7065"/>
+                <w:tab w:val="left" w:pos="8787"/>
+                <w:tab w:val="left" w:pos="9363"/>
+                <w:tab w:val="left" w:pos="9599"/>
+              </w:tabs>
+              <w:spacing w:before="120"/>
+            </w:pPr>
+            <w:r>
+              <w:t>Дата</w:t>
+            </w:r>
+            <w:r>
+              <w:rPr>
+                <w:lang w:val="en-US"/>
+              </w:rPr>
+              <w:t> </w:t>
+            </w:r>
+            <w:r>
+              <w:t>получения</w:t>
+            </w:r>
+            <w:r>
+              <w:rPr>
+                <w:lang w:val="en-US"/>
+              </w:rPr>
+              <w:t> </w:t>
+            </w:r>
+            <w:r>
+              <w:t>задания</w:t>
+            </w:r>
+          </w:p>
+          <w:p>
+            <w:pPr>
+              <w:pStyle w:val="87"/>
+              <w:tabs>
+                <w:tab w:val="left" w:pos="5898"/>
+                <w:tab w:val="left" w:pos="6306"/>
+                <w:tab w:val="left" w:pos="6729"/>
+                <w:tab w:val="left" w:pos="7065"/>
+                <w:tab w:val="left" w:pos="8787"/>
+                <w:tab w:val="left" w:pos="9363"/>
+                <w:tab w:val="left" w:pos="9599"/>
+              </w:tabs>
+              <w:spacing w:before="120"/>
+            </w:pPr>
+            <w:r>
+              <w:t>Срок представления обучающимся работы</w:t>
+            </w:r>
+          </w:p>
+        </w:tc>
+        <w:tc>
+          <w:tcPr>
+            <w:tcW w:w="3111" w:type="dxa"/>
+            <w:tcMar>
+              <w:top w:w="0" w:type="dxa"/>
+              <w:left w:w="0" w:type="dxa"/>
+              <w:bottom w:w="0" w:type="dxa"/>
+              <w:right w:w="0" w:type="dxa"/>
+            </w:tcMar>
+          </w:tcPr>
+          <w:p>
+            <w:pPr>
+              <w:pStyle w:val="87"/>
+              <w:tabs>
+                <w:tab w:val="left" w:pos="5898"/>
+                <w:tab w:val="left" w:pos="6306"/>
+                <w:tab w:val="left" w:pos="6729"/>
+                <w:tab w:val="left" w:pos="7065"/>
+                <w:tab w:val="left" w:pos="8787"/>
+                <w:tab w:val="left" w:pos="9363"/>
+                <w:tab w:val="left" w:pos="9599"/>
+              </w:tabs>
+              <w:spacing w:before="120"/>
+            </w:pPr>
+            <w:r>
+              <w:t>«_____»___________20___г.</w:t>
+              <w:br/>
+              <w:t>«_____»___________20___г.</w:t>
+            </w:r>
+          </w:p>
+        </w:tc>
+      </w:tr>
+    </w:tbl>
+    <w:p>
+      <w:pPr>
+        <w:pStyle w:val="87"/>
+        <w:tabs>
+          <w:tab w:val="left" w:pos="5898"/>
+          <w:tab w:val="left" w:pos="6306"/>
+          <w:tab w:val="left" w:pos="6729"/>
+          <w:tab w:val="left" w:pos="7065"/>
+          <w:tab w:val="left" w:pos="8787"/>
+          <w:tab w:val="left" w:pos="9363"/>
+          <w:tab w:val="left" w:pos="9599"/>
+        </w:tabs>
+        <w:spacing w:before="120"/>
+      </w:pPr>
+      <w:r>
+        <w:br w:type="textWrapping"/>
+      </w:r>
+    </w:p>
+    <w:tbl>
+      <w:tblPr>
+        <w:tblStyle w:val="7"/>
+        <w:tblW w:w="9870" w:type="dxa"/>
+        <w:tblInd w:w="0" w:type="dxa"/>
+        <w:tblLayout w:type="fixed"/>
+        <w:tblCellMar>
+          <w:top w:w="0" w:type="dxa"/>
+          <w:left w:w="10" w:type="dxa"/>
+          <w:bottom w:w="0" w:type="dxa"/>
+          <w:right w:w="10" w:type="dxa"/>
+        </w:tblCellMar>
+      </w:tblPr>
+      <w:tblGrid>
+        <w:gridCol w:w="3060"/>
+        <w:gridCol w:w="3750"/>
+        <w:gridCol w:w="3060"/>
+      </w:tblGrid>
+      <w:tr>
+        <w:tblPrEx>
+          <w:tblCellMar>
+            <w:top w:w="0" w:type="dxa"/>
+            <w:left w:w="10" w:type="dxa"/>
+            <w:bottom w:w="0" w:type="dxa"/>
+            <w:right w:w="10" w:type="dxa"/>
+          </w:tblCellMar>
+        </w:tblPrEx>
+        <w:trPr>
+          <w:trHeight w:val="960" w:hRule="atLeast"/>
+        </w:trPr>
+        <w:tc>
+          <w:tcPr>
+            <w:tcW w:w="3060" w:type="dxa"/>
+            <w:tcMar>
+              <w:top w:w="0" w:type="dxa"/>
+              <w:left w:w="0" w:type="dxa"/>
+              <w:bottom w:w="0" w:type="dxa"/>
+              <w:right w:w="0" w:type="dxa"/>
+            </w:tcMar>
+          </w:tcPr>
+          <w:p>
+            <w:pPr>
+              <w:pStyle w:val="87"/>
+              <w:spacing w:line="240" w:lineRule="auto"/>
+            </w:pPr>
+            <w:r>
+              <w:t>Руководитель </w:t>
+            </w:r>
+            <w:r>
+              <w:rPr>
+                <w:b/>
+                <w:bCs/>
+                <w:i/>
+                <w:iCs/>
+                <w:lang w:bidi="ar-SA"/>
+              </w:rPr>
+            </w:r>
+          </w:p>
+          <w:p>
+            <w:pPr>
+              <w:pStyle w:val="87"/>
+              <w:tabs>
+                <w:tab w:val="left" w:pos="2693"/>
+                <w:tab w:val="left" w:pos="5529"/>
+                <w:tab w:val="left" w:pos="6356"/>
+              </w:tabs>
+              <w:rPr>
+                <w:sz w:val="16"/>
+                <w:szCs w:val="16"/>
+              </w:rPr>
+            </w:pPr>
+            <w:r>
+              <w:rPr>
+                <w:sz w:val="16"/>
+                <w:szCs w:val="16"/>
+              </w:rPr>
+              <w:t xml:space="preserve">                          должность, степень, звание</w:t>
+            </w:r>
+          </w:p>
+          <w:p>
+            <w:pPr>
+              <w:pStyle w:val="87"/>
+              <w:rPr>
+                <w:b/>
+                <w:bCs/>
+                <w:i/>
+                <w:iCs/>
+                <w:lang w:bidi="ar-SA"/>
+              </w:rPr>
+            </w:pPr>
+            <w:r>
+              <w:rPr>
+                <w:b/>
+                <w:bCs/>
+                <w:i/>
+                <w:iCs/>
+                <w:lang w:bidi="ar-SA"/>
+              </w:rPr>
+              <w:t>Обучающийся</w:t>
+            </w:r>
+          </w:p>
+        </w:tc>
+        <w:tc>
+          <w:tcPr>
+            <w:tcW w:w="3750" w:type="dxa"/>
+            <w:tcMar>
+              <w:top w:w="0" w:type="dxa"/>
+              <w:left w:w="0" w:type="dxa"/>
+              <w:bottom w:w="0" w:type="dxa"/>
+              <w:right w:w="0" w:type="dxa"/>
+            </w:tcMar>
+          </w:tcPr>
+          <w:p>
+            <w:pPr>
+              <w:pStyle w:val="87"/>
+              <w:spacing w:line="240" w:lineRule="auto"/>
+            </w:pPr>
+            <w:r>
+              <w:t xml:space="preserve">_________   </w:t>
+            </w:r>
+            <w:r>
+              <w:rPr>
+                <w:b/>
+                <w:bCs/>
+                <w:i/>
+                <w:iCs/>
+              </w:rPr>
+              <w:t>Кузнецова В.Ю.</w:t>
+            </w:r>
+          </w:p>
+          <w:p>
+            <w:pPr>
+              <w:pStyle w:val="87"/>
+              <w:tabs>
+                <w:tab w:val="left" w:pos="2693"/>
+                <w:tab w:val="left" w:pos="5529"/>
+                <w:tab w:val="left" w:pos="6356"/>
+              </w:tabs>
+            </w:pPr>
+            <w:r>
+              <w:rPr>
+                <w:i/>
+                <w:iCs/>
+                <w:sz w:val="16"/>
+                <w:szCs w:val="16"/>
+              </w:rPr>
+              <w:t xml:space="preserve">      подпись                            ФИО</w:t>
+            </w:r>
+          </w:p>
+          <w:p>
+            <w:pPr>
+              <w:pStyle w:val="87"/>
+              <w:spacing w:line="240" w:lineRule="auto"/>
+            </w:pPr>
+            <w:r>
+              <w:t xml:space="preserve">_________   </w:t>
+            </w:r>
+            <w:r>
+              <w:rPr>
+                <w:b/>
+                <w:bCs/>
+                <w:i/>
+                <w:iCs/>
+              </w:rPr>
+              <w:t>Шатуев Р.С.</w:t>
+            </w:r>
+          </w:p>
+          <w:p>
+            <w:pPr>
+              <w:pStyle w:val="87"/>
+              <w:tabs>
+                <w:tab w:val="left" w:pos="2693"/>
+                <w:tab w:val="left" w:pos="5529"/>
+                <w:tab w:val="left" w:pos="6356"/>
+              </w:tabs>
+              <w:spacing w:line="276" w:lineRule="auto"/>
+            </w:pPr>
+            <w:r>
+              <w:rPr>
+                <w:i/>
+                <w:iCs/>
+                <w:sz w:val="16"/>
+                <w:szCs w:val="16"/>
+              </w:rPr>
+              <w:t xml:space="preserve">      подпись                            ФИО</w:t>
+            </w:r>
+          </w:p>
+        </w:tc>
+        <w:tc>
+          <w:tcPr>
+            <w:tcW w:w="3060" w:type="dxa"/>
+            <w:tcMar>
+              <w:top w:w="0" w:type="dxa"/>
+              <w:left w:w="0" w:type="dxa"/>
+              <w:bottom w:w="0" w:type="dxa"/>
+              <w:right w:w="0" w:type="dxa"/>
+            </w:tcMar>
+          </w:tcPr>
+          <w:p>
+            <w:pPr>
+              <w:pStyle w:val="87"/>
+              <w:spacing w:line="240" w:lineRule="auto"/>
+            </w:pPr>
+            <w:r>
+              <w:t>«_____»___________20___г.</w:t>
+            </w:r>
+          </w:p>
+          <w:p>
+            <w:pPr>
+              <w:pStyle w:val="87"/>
+              <w:tabs>
+                <w:tab w:val="left" w:pos="2693"/>
+                <w:tab w:val="left" w:pos="5529"/>
+                <w:tab w:val="left" w:pos="6356"/>
+              </w:tabs>
+            </w:pPr>
+          </w:p>
+          <w:p>
+            <w:pPr>
+              <w:pStyle w:val="87"/>
+            </w:pPr>
+            <w:r>
+              <w:t>«_____»___________20___г.</w:t>
+            </w:r>
+          </w:p>
+        </w:tc>
+      </w:tr>
+    </w:tbl>
+    <w:p>
+      <w:pPr>
+        <w:tabs>
+          <w:tab w:val="left" w:pos="2693"/>
+          <w:tab w:val="left" w:pos="5529"/>
+          <w:tab w:val="left" w:pos="7388"/>
+        </w:tabs>
+        <w:spacing w:before="120"/>
+        <w:jc w:val="left"/>
+        <w:rPr>
+          <w:rFonts w:ascii="Times New Roman" w:hAnsi="Times New Roman"/>
+          <w:sz w:val="2"/>
+          <w:szCs w:val="2"/>
+        </w:rPr>
+      </w:pPr>
+    </w:p>
+    <w:p>
+      <w:pPr>
+        <w:pStyle w:val="87"/>
+        <w:spacing w:before="240"/>
+        <w:jc w:val="center"/>
+        <w:rPr>
+          <w:b/>
+        </w:rPr>
+      </w:pPr>
+      <w:r>
+        <w:rPr>
+          <w:b/>
+        </w:rPr>
+        <w:t>Задачи</w:t>
+      </w:r>
+    </w:p>
+    <w:p>
+      <w:pPr>
+        <w:pStyle w:val="87"/>
+        <w:widowControl w:val="0"/>
+        <w:numPr>
+          <w:ilvl w:val="0"/>
+          <w:numId w:val="3"/>
+        </w:numPr>
+        <w:jc w:val="both"/>
+      </w:pPr>
+      <w:r>
+        <w:rPr>
+          <w:rFonts w:eastAsia="Calibri" w:cs="Verdana"/>
+          <w:bCs/>
+          <w:color w:val="000000"/>
+          <w:lang w:bidi="ar-SA"/>
+        </w:rPr>
+        <w:t>Зафиксировать требования и критерии виртуальной проверки.</w:t>
+      </w:r>
+    </w:p>
+    <w:p>
+      <w:pPr>
+        <w:pStyle w:val="87"/>
+        <w:widowControl w:val="0"/>
+        <w:numPr>
+          <w:ilvl w:val="0"/>
+          <w:numId w:val="4"/>
+        </w:numPr>
+        <w:jc w:val="both"/>
+        <w:rPr>
+          <w:rFonts w:eastAsia="Calibri" w:cs="Verdana"/>
+          <w:bCs/>
+          <w:color w:val="000000"/>
+          <w:lang w:bidi="ar-SA"/>
+        </w:rPr>
+      </w:pPr>
+      <w:r>
+        <w:rPr>
+          <w:rFonts w:eastAsia="Calibri" w:cs="Verdana"/>
+          <w:bCs/>
+          <w:color w:val="000000"/>
+          <w:lang w:bidi="ar-SA"/>
+        </w:rPr>
+        <w:t>Спроектировать архитектуру и параметрическую модель манипулятора SCARA.</w:t>
+      </w:r>
+    </w:p>
+    <w:p>
+      <w:pPr>
+        <w:pStyle w:val="87"/>
+        <w:widowControl w:val="0"/>
+        <w:numPr>
+          <w:ilvl w:val="0"/>
+          <w:numId w:val="4"/>
+        </w:numPr>
+        <w:jc w:val="both"/>
+        <w:rPr>
+          <w:rFonts w:eastAsia="Calibri" w:cs="Verdana"/>
+          <w:bCs/>
+          <w:color w:val="000000"/>
+          <w:lang w:bidi="ar-SA"/>
+        </w:rPr>
+      </w:pPr>
+      <w:r>
+        <w:rPr>
+          <w:rFonts w:eastAsia="Calibri" w:cs="Verdana"/>
+          <w:bCs/>
+          <w:color w:val="000000"/>
+          <w:lang w:bidi="ar-SA"/>
+        </w:rPr>
+        <w:t>Реализовать и проверить прямую и обратную кинематику.</w:t>
+      </w:r>
+    </w:p>
+    <w:p>
+      <w:pPr>
+        <w:pStyle w:val="87"/>
+        <w:widowControl w:val="0"/>
+        <w:numPr>
+          <w:ilvl w:val="0"/>
+          <w:numId w:val="4"/>
+        </w:numPr>
+        <w:jc w:val="both"/>
+        <w:rPr>
+          <w:rFonts w:eastAsia="Calibri" w:cs="Verdana"/>
+          <w:bCs/>
+          <w:color w:val="000000"/>
+          <w:lang w:bidi="ar-SA"/>
+        </w:rPr>
+      </w:pPr>
+      <w:r>
+        <w:rPr>
+          <w:rFonts w:eastAsia="Calibri" w:cs="Verdana"/>
+          <w:bCs/>
+          <w:color w:val="000000"/>
+          <w:lang w:bidi="ar-SA"/>
+        </w:rPr>
+        <w:t>Реализовать распознавание цвета и определение координат объектов.</w:t>
+      </w:r>
+    </w:p>
+    <w:p>
+      <w:pPr>
+        <w:pStyle w:val="87"/>
+        <w:widowControl w:val="0"/>
+        <w:numPr>
+          <w:ilvl w:val="0"/>
+          <w:numId w:val="4"/>
+        </w:numPr>
+        <w:jc w:val="both"/>
+        <w:rPr>
+          <w:rFonts w:eastAsia="Calibri" w:cs="Verdana"/>
+          <w:bCs/>
+          <w:color w:val="000000"/>
+          <w:lang w:bidi="ar-SA"/>
+        </w:rPr>
+      </w:pPr>
+      <w:r>
+        <w:rPr>
+          <w:rFonts w:eastAsia="Calibri" w:cs="Verdana"/>
+          <w:bCs/>
+          <w:color w:val="000000"/>
+          <w:lang w:bidi="ar-SA"/>
+        </w:rPr>
+        <w:t>Разработать безопасное планирование траекторий и цикл захвата и сортировки.</w:t>
+      </w:r>
+    </w:p>
+    <w:p>
+      <w:pPr>
+        <w:pStyle w:val="87"/>
+        <w:widowControl w:val="0"/>
+        <w:numPr>
+          <w:ilvl w:val="0"/>
+          <w:numId w:val="4"/>
+        </w:numPr>
+        <w:jc w:val="both"/>
+        <w:rPr>
+          <w:rFonts w:eastAsia="Calibri" w:cs="Verdana"/>
+          <w:bCs/>
+          <w:color w:val="000000"/>
+          <w:lang w:bidi="ar-SA"/>
+        </w:rPr>
+      </w:pPr>
+      <w:r>
+        <w:rPr>
+          <w:rFonts w:eastAsia="Calibri" w:cs="Verdana"/>
+          <w:bCs/>
+          <w:color w:val="000000"/>
+          <w:lang w:bidi="ar-SA"/>
+        </w:rPr>
+        <w:t>Интегрировать систему в симуляцию, провести виртуальные испытания и подготовить документацию.</w:t>
+      </w:r>
+    </w:p>
+    <w:p>
+      <w:pPr>
+        <w:spacing w:before="240" w:line="360" w:lineRule="auto"/>
+        <w:rPr>
+          <w:rFonts w:ascii="Times New Roman" w:hAnsi="Times New Roman"/>
+          <w:b/>
+          <w:sz w:val="24"/>
+        </w:rPr>
+      </w:pPr>
+    </w:p>
+    <w:p>
+      <w:pPr>
+        <w:spacing w:before="240" w:line="360" w:lineRule="auto"/>
+        <w:jc w:val="center"/>
+        <w:rPr>
+          <w:rFonts w:ascii="Times New Roman" w:hAnsi="Times New Roman"/>
+          <w:b/>
+          <w:sz w:val="24"/>
+        </w:rPr>
+      </w:pPr>
+      <w:r>
+        <w:rPr>
+          <w:rFonts w:ascii="Times New Roman" w:hAnsi="Times New Roman"/>
+          <w:b/>
+          <w:sz w:val="24"/>
+        </w:rPr>
+        <w:t>Список рекомендуемой литературы</w:t>
+      </w:r>
+    </w:p>
+    <w:p>
+      <w:pPr>
+        <w:pStyle w:val="87"/>
+        <w:widowControl w:val="0"/>
+        <w:numPr>
+          <w:ilvl w:val="0"/>
+          <w:numId w:val="5"/>
+        </w:numPr>
+        <w:jc w:val="both"/>
+        <w:rPr>
+          <w:rFonts w:eastAsia="Calibri" w:cs="Verdana"/>
+          <w:bCs/>
+          <w:color w:val="000000"/>
+          <w:lang w:bidi="ar-SA"/>
+        </w:rPr>
+      </w:pPr>
+      <w:r>
+        <w:rPr>
+          <w:rFonts w:eastAsia="Calibri" w:cs="Verdana"/>
+          <w:bCs/>
+          <w:color w:val="000000"/>
+          <w:lang w:bidi="ar-SA"/>
+        </w:rPr>
+        <w:t>Lynch K. M., Park F. C. Modern Robotics: Mechanics, Planning, and Control. Cambridge University Press, 2017. URL: https://modernrobotics.northwestern.edu/nu-gm-book-resource/ (дата обращения: 27.09.2026).</w:t>
+      </w:r>
+    </w:p>
+    <w:p>
+      <w:pPr>
+        <w:pStyle w:val="87"/>
+        <w:widowControl w:val="0"/>
+        <w:numPr>
+          <w:ilvl w:val="0"/>
+          <w:numId w:val="5"/>
+        </w:numPr>
+        <w:jc w:val="both"/>
+        <w:rPr>
+          <w:rFonts w:eastAsia="Calibri" w:cs="Verdana"/>
+          <w:bCs/>
+          <w:color w:val="000000"/>
+          <w:lang w:bidi="ar-SA"/>
+        </w:rPr>
+      </w:pPr>
+      <w:r>
+        <w:rPr>
+          <w:bCs/>
+          <w:color w:val="000000"/>
+          <w:lang w:bidi="ar-SA"/>
+        </w:rPr>
+        <w:t>Google DeepMind. MuJoCo Documentation: Modeling; XML Reference; API Reference. URL: https://mujoco.readthedocs.io/en/stable/ (дата обращения: 27.09.2026).</w:t>
+      </w:r>
+    </w:p>
+    <w:p>
+      <w:pPr>
+        <w:pStyle w:val="87"/>
+        <w:widowControl w:val="0"/>
+        <w:numPr>
+          <w:ilvl w:val="0"/>
+          <w:numId w:val="5"/>
+        </w:numPr>
+        <w:jc w:val="both"/>
+        <w:rPr>
+          <w:rFonts w:eastAsia="Calibri" w:cs="Verdana"/>
+          <w:bCs/>
+          <w:color w:val="000000"/>
+          <w:lang w:bidi="ar-SA"/>
+        </w:rPr>
+      </w:pPr>
+      <w:r>
+        <w:rPr>
+          <w:bCs/>
+          <w:color w:val="000000"/>
+          <w:lang w:bidi="ar-SA"/>
+        </w:rPr>
+        <w:t>OpenCV. OpenCV 4.12.0 Documentation: Color Space Conversions; Features2D + Homography. URL: https://docs.opencv.org/4.12.0/d8/d01/group__imgproc__color__conversions.html; https://docs.opencv.org/4.12.0/d7/dff/tutorial_feature_homography.html (дата обращения: 27.09.2026).</w:t>
+      </w:r>
+    </w:p>
+    <w:p>
+      <w:pPr>
+        <w:pStyle w:val="87"/>
+        <w:widowControl w:val="0"/>
+        <w:numPr>
+          <w:ilvl w:val="0"/>
+          <w:numId w:val="5"/>
+        </w:numPr>
+        <w:jc w:val="both"/>
+        <w:rPr>
+          <w:rFonts w:eastAsia="Calibri" w:cs="Verdana"/>
+          <w:bCs/>
+          <w:color w:val="000000"/>
+          <w:lang w:bidi="ar-SA"/>
+        </w:rPr>
+      </w:pPr>
+      <w:r>
+        <w:rPr>
+          <w:bCs/>
+          <w:color w:val="000000"/>
+          <w:lang w:bidi="ar-SA"/>
+        </w:rPr>
+        <w:t>NIST. Guide to the SI, Appendix B.9: Factors for units listed by kind of quantity or field of science. URL: https://www.nist.gov/pml/special-publication-811/nist-guide-si-appendix-b-conversion-factors/nist-guide-si-appendix-b9 (дата обращения: 27.09.2026).</w:t>
+      </w:r>
+    </w:p>
+    <w:p>
+      <w:pPr>
+        <w:pStyle w:val="87"/>
+        <w:widowControl w:val="0"/>
+        <w:numPr>
+          <w:ilvl w:val="0"/>
+          <w:numId w:val="5"/>
+        </w:numPr>
+        <w:jc w:val="both"/>
+        <w:rPr>
+          <w:rFonts w:eastAsia="Calibri" w:cs="Verdana"/>
+          <w:bCs/>
+          <w:color w:val="000000"/>
+          <w:lang w:bidi="ar-SA"/>
+        </w:rPr>
+      </w:pPr>
+      <w:r>
+        <w:rPr>
+          <w:rFonts w:eastAsia="Calibri" w:cs="Verdana"/>
+          <w:bCs/>
+          <w:color w:val="000000"/>
+          <w:lang w:bidi="ar-SA"/>
+        </w:rPr>
+        <w:t>Prusa Polymers. Prusament PLA Technical Data Sheet. URL: https://prusament.com/wp-content/uploads/2022/10/PLA_Prusament_TDS_2021_10_EN.pdf (дата обращения: 27.09.2026).</w:t>
+      </w:r>
+    </w:p>
+    <w:p>
+      <w:pPr>
+        <w:pStyle w:val="87"/>
+        <w:widowControl w:val="0"/>
+        <w:numPr>
+          <w:ilvl w:val="0"/>
+          <w:numId w:val="5"/>
+        </w:numPr>
+        <w:jc w:val="both"/>
+        <w:rPr>
+          <w:rFonts w:eastAsia="Calibri" w:cs="Verdana"/>
+          <w:bCs/>
+          <w:color w:val="000000"/>
+          <w:lang w:bidi="ar-SA"/>
+        </w:rPr>
+      </w:pPr>
+      <w:r>
+        <w:rPr>
+          <w:rFonts w:eastAsia="Calibri" w:cs="Verdana"/>
+          <w:bCs/>
+          <w:color w:val="000000"/>
+          <w:lang w:bidi="ar-SA"/>
+        </w:rPr>
+        <w:t>Проектная документация M1–M9: архитектура, SSOT, кинематика, зрение, планирование, FSM, интеграция, протокол и отчет виртуальных испытаний. Исходники и версии сохранены в составе проекта.</w:t>
+      </w:r>
+    </w:p>
+    <w:p>
+      <w:pPr>
+        <w:rPr>
+          <w:rFonts w:ascii="Times New Roman" w:hAnsi="Times New Roman"/>
+          <w:sz w:val="2"/>
+          <w:szCs w:val="2"/>
+        </w:rPr>
+      </w:pPr>
+      <w:r>
+        <w:rPr>
+          <w:rFonts w:ascii="Times New Roman" w:hAnsi="Times New Roman"/>
+        </w:rPr>
+        <w:br w:type="page"/>
+      </w:r>
+    </w:p>
+    <w:tbl>
+      <w:tblPr>
+        <w:tblStyle w:val="7"/>
+        <w:tblW w:w="0" w:type="auto"/>
+        <w:tblInd w:w="0" w:type="dxa"/>
+        <w:tblLayout w:type="fixed"/>
+        <w:tblCellMar>
+          <w:top w:w="0" w:type="dxa"/>
+          <w:left w:w="108" w:type="dxa"/>
+          <w:bottom w:w="0" w:type="dxa"/>
+          <w:right w:w="108" w:type="dxa"/>
+        </w:tblCellMar>
+      </w:tblPr>
+      <w:tblGrid>
+        <w:gridCol w:w="5419"/>
+        <w:gridCol w:w="4718"/>
+      </w:tblGrid>
+      <w:tr>
+        <w:tblPrEx>
+          <w:tblCellMar>
+            <w:top w:w="0" w:type="dxa"/>
+            <w:left w:w="108" w:type="dxa"/>
+            <w:bottom w:w="0" w:type="dxa"/>
+            <w:right w:w="108" w:type="dxa"/>
+          </w:tblCellMar>
+        </w:tblPrEx>
+        <w:tc>
+          <w:tcPr>
+            <w:tcW w:w="5419" w:type="dxa"/>
+          </w:tcPr>
+          <w:p>
+            <w:pPr>
+              <w:spacing w:line="360" w:lineRule="auto"/>
+              <w:rPr>
+                <w:rFonts w:ascii="Times New Roman" w:hAnsi="Times New Roman"/>
+                <w:sz w:val="24"/>
+              </w:rPr>
+            </w:pPr>
+            <w:r>
+              <w:rPr>
+                <w:rFonts w:ascii="Times New Roman" w:hAnsi="Times New Roman"/>
+                <w:b/>
+                <w:sz w:val="24"/>
+              </w:rPr>
+              <w:t>УТВЕРЖДАЮ</w:t>
+            </w:r>
+          </w:p>
+        </w:tc>
+        <w:tc>
+          <w:tcPr>
+            <w:tcW w:w="4718" w:type="dxa"/>
+            <w:vMerge w:val="restart"/>
+            <w:vAlign w:val="center"/>
+          </w:tcPr>
+          <w:p>
+            <w:pPr>
+              <w:pStyle w:val="87"/>
+              <w:jc w:val="center"/>
+            </w:pPr>
+            <w:r>
+              <w:t>К заданию на курсовую работу</w:t>
+              <w:br/>
+              <w:t>по дисциплине</w:t>
+              <w:br/>
+              <w:t>«Моделирование роботов»</w:t>
+            </w:r>
+          </w:p>
+          <w:p>
+            <w:pPr>
+              <w:pStyle w:val="87"/>
+              <w:jc w:val="center"/>
+            </w:pPr>
+          </w:p>
+          <w:p>
+            <w:pPr>
+              <w:spacing w:line="360" w:lineRule="auto"/>
+              <w:jc w:val="center"/>
+              <w:rPr>
+                <w:rFonts w:ascii="Times New Roman" w:hAnsi="Times New Roman"/>
+                <w:sz w:val="24"/>
+              </w:rPr>
+            </w:pPr>
+          </w:p>
+        </w:tc>
+      </w:tr>
+      <w:tr>
+        <w:tblPrEx>
+          <w:tblCellMar>
+            <w:top w:w="0" w:type="dxa"/>
+            <w:left w:w="108" w:type="dxa"/>
+            <w:bottom w:w="0" w:type="dxa"/>
+            <w:right w:w="108" w:type="dxa"/>
+          </w:tblCellMar>
+        </w:tblPrEx>
+        <w:trPr>
+          <w:trHeight w:val="2023" w:hRule="atLeast"/>
+        </w:trPr>
+        <w:tc>
+          <w:tcPr>
+            <w:tcW w:w="5419" w:type="dxa"/>
+          </w:tcPr>
+          <w:p>
+            <w:pPr>
+              <w:spacing w:line="360" w:lineRule="auto"/>
+              <w:rPr>
+                <w:rFonts w:ascii="Times New Roman" w:hAnsi="Times New Roman"/>
+                <w:sz w:val="24"/>
+              </w:rPr>
+            </w:pPr>
+            <w:r>
+              <w:rPr>
+                <w:rFonts w:ascii="Times New Roman" w:hAnsi="Times New Roman"/>
+                <w:sz w:val="24"/>
+              </w:rPr>
+              <w:t>Заведующий кафедрой</w:t>
+            </w:r>
+          </w:p>
+          <w:p>
+            <w:pPr>
+              <w:spacing w:line="360" w:lineRule="auto"/>
+              <w:rPr>
+                <w:rFonts w:ascii="Times New Roman" w:hAnsi="Times New Roman"/>
+                <w:sz w:val="24"/>
+              </w:rPr>
+            </w:pPr>
+          </w:p>
+          <w:p>
+            <w:pPr>
+              <w:spacing w:line="360" w:lineRule="auto"/>
+              <w:rPr>
+                <w:rFonts w:ascii="Times New Roman" w:hAnsi="Times New Roman"/>
+                <w:sz w:val="24"/>
+              </w:rPr>
+            </w:pPr>
+            <w:r>
+              <w:rPr>
+                <w:rFonts w:ascii="Times New Roman" w:hAnsi="Times New Roman"/>
+                <w:sz w:val="24"/>
+              </w:rPr>
+              <w:t>______________________________</w:t>
+            </w:r>
+          </w:p>
+          <w:p>
+            <w:pPr>
+              <w:spacing w:line="360" w:lineRule="auto"/>
+              <w:rPr>
+                <w:rFonts w:ascii="Times New Roman" w:hAnsi="Times New Roman"/>
+                <w:sz w:val="24"/>
+              </w:rPr>
+            </w:pPr>
+            <w:r>
+              <w:rPr>
+                <w:rFonts w:ascii="Times New Roman" w:hAnsi="Times New Roman"/>
+                <w:sz w:val="24"/>
+              </w:rPr>
+              <w:t>«____»__________________20___г.</w:t>
+            </w:r>
+          </w:p>
+        </w:tc>
+        <w:tc>
+          <w:tcPr>
+            <w:tcW w:w="4718" w:type="dxa"/>
+            <w:vMerge w:val="continue"/>
+          </w:tcPr>
+          <w:p>
+            <w:pPr>
+              <w:spacing w:line="360" w:lineRule="auto"/>
+              <w:rPr>
+                <w:rFonts w:ascii="Times New Roman" w:hAnsi="Times New Roman"/>
+                <w:sz w:val="24"/>
+              </w:rPr>
+            </w:pPr>
+          </w:p>
+        </w:tc>
+      </w:tr>
+    </w:tbl>
+    <w:p>
+      <w:pPr>
+        <w:jc w:val="center"/>
+        <w:rPr>
+          <w:rFonts w:ascii="Times New Roman" w:hAnsi="Times New Roman"/>
+          <w:b/>
+          <w:sz w:val="24"/>
+        </w:rPr>
+      </w:pPr>
+      <w:r>
+        <w:rPr>
+          <w:rFonts w:ascii="Times New Roman" w:hAnsi="Times New Roman"/>
+          <w:b/>
+          <w:sz w:val="24"/>
+        </w:rPr>
+        <w:t>КАЛЕНДАРНЫЙ ГРАФИК</w:t>
+      </w:r>
+    </w:p>
+    <w:p>
+      <w:pPr>
+        <w:jc w:val="center"/>
+        <w:rPr>
+          <w:rFonts w:ascii="Times New Roman" w:hAnsi="Times New Roman"/>
+          <w:sz w:val="24"/>
+        </w:rPr>
+      </w:pPr>
+      <w:r>
+        <w:rPr>
+          <w:rFonts w:ascii="Times New Roman" w:hAnsi="Times New Roman"/>
+          <w:sz w:val="24"/>
+        </w:rPr>
+        <w:t>Курсовой работы</w:t>
+      </w:r>
+    </w:p>
+    <w:p>
+      <w:pPr>
+        <w:jc w:val="center"/>
+        <w:rPr>
+          <w:rFonts w:ascii="Times New Roman" w:hAnsi="Times New Roman"/>
+          <w:sz w:val="24"/>
+        </w:rPr>
+      </w:pPr>
+    </w:p>
+    <w:tbl>
+      <w:tblPr>
+        <w:tblStyle w:val="7"/>
+        <w:tblW w:w="9919" w:type="dxa"/>
+        <w:tblInd w:w="116" w:type="dxa"/>
+        <w:tblLayout w:type="fixed"/>
+        <w:tblCellMar>
+          <w:top w:w="0" w:type="dxa"/>
+          <w:left w:w="10" w:type="dxa"/>
+          <w:bottom w:w="0" w:type="dxa"/>
+          <w:right w:w="10" w:type="dxa"/>
+        </w:tblCellMar>
+      </w:tblPr>
+      <w:tblGrid>
+        <w:gridCol w:w="563"/>
+        <w:gridCol w:w="6928"/>
+        <w:gridCol w:w="1440"/>
+        <w:gridCol w:w="988"/>
+      </w:tblGrid>
+      <w:tr>
+        <w:tblPrEx>
+          <w:tblCellMar>
+            <w:top w:w="0" w:type="dxa"/>
+            <w:left w:w="10" w:type="dxa"/>
+            <w:bottom w:w="0" w:type="dxa"/>
+            <w:right w:w="10" w:type="dxa"/>
+          </w:tblCellMar>
+        </w:tblPrEx>
+        <w:trPr>
+          <w:trHeight w:val="230" w:hRule="atLeast"/>
+        </w:trPr>
+        <w:tc>
+          <w:tcPr>
+            <w:tcW w:w="563" w:type="dxa"/>
+            <w:tcBorders>
+              <w:top w:val="single" w:color="000000" w:sz="6" w:space="0"/>
+              <w:left w:val="single" w:color="000000" w:sz="6" w:space="0"/>
+              <w:bottom w:val="single" w:color="000000" w:sz="6" w:space="0"/>
+            </w:tcBorders>
+            <w:tcMar>
+              <w:top w:w="0" w:type="dxa"/>
+              <w:left w:w="108" w:type="dxa"/>
+              <w:bottom w:w="0" w:type="dxa"/>
+              <w:right w:w="108" w:type="dxa"/>
+            </w:tcMar>
+          </w:tcPr>
+          <w:p>
+            <w:pPr>
+              <w:pStyle w:val="87"/>
+              <w:ind w:left="-57" w:right="-57"/>
+              <w:jc w:val="center"/>
+            </w:pPr>
+            <w:r>
+              <w:t>№ п/п</w:t>
+            </w:r>
+          </w:p>
+        </w:tc>
+        <w:tc>
+          <w:tcPr>
+            <w:tcW w:w="6928" w:type="dxa"/>
+            <w:tcBorders>
+              <w:top w:val="single" w:color="000000" w:sz="6" w:space="0"/>
+              <w:left w:val="single" w:color="000000" w:sz="6" w:space="0"/>
+              <w:bottom w:val="single" w:color="000000" w:sz="6" w:space="0"/>
+            </w:tcBorders>
+            <w:tcMar>
+              <w:top w:w="0" w:type="dxa"/>
+              <w:left w:w="108" w:type="dxa"/>
+              <w:bottom w:w="0" w:type="dxa"/>
+              <w:right w:w="108" w:type="dxa"/>
+            </w:tcMar>
+            <w:vAlign w:val="center"/>
+          </w:tcPr>
+          <w:p>
+            <w:pPr>
+              <w:pStyle w:val="87"/>
+              <w:jc w:val="center"/>
+            </w:pPr>
+            <w:r>
+              <w:t>Разделы, темы и их содержание, графический материал</w:t>
+            </w:r>
+          </w:p>
+        </w:tc>
+        <w:tc>
+          <w:tcPr>
+            <w:tcW w:w="1440" w:type="dxa"/>
+            <w:tcBorders>
+              <w:top w:val="single" w:color="000000" w:sz="6" w:space="0"/>
+              <w:left w:val="single" w:color="000000" w:sz="6" w:space="0"/>
+              <w:bottom w:val="single" w:color="000000" w:sz="6" w:space="0"/>
+            </w:tcBorders>
+            <w:tcMar>
+              <w:top w:w="0" w:type="dxa"/>
+              <w:left w:w="108" w:type="dxa"/>
+              <w:bottom w:w="0" w:type="dxa"/>
+              <w:right w:w="108" w:type="dxa"/>
+            </w:tcMar>
+            <w:vAlign w:val="center"/>
+          </w:tcPr>
+          <w:p>
+            <w:pPr>
+              <w:pStyle w:val="87"/>
+              <w:jc w:val="center"/>
+            </w:pPr>
+            <w:r>
+              <w:t>Дата сдачи</w:t>
+            </w:r>
+          </w:p>
+        </w:tc>
+        <w:tc>
+          <w:tcPr>
+            <w:tcW w:w="988" w:type="dxa"/>
+            <w:tcBorders>
+              <w:top w:val="single" w:color="000000" w:sz="6" w:space="0"/>
+              <w:left w:val="single" w:color="000000" w:sz="6" w:space="0"/>
+              <w:bottom w:val="single" w:color="000000" w:sz="6" w:space="0"/>
+              <w:right w:val="single" w:color="000000" w:sz="6" w:space="0"/>
+            </w:tcBorders>
+            <w:tcMar>
+              <w:top w:w="0" w:type="dxa"/>
+              <w:left w:w="108" w:type="dxa"/>
+              <w:bottom w:w="0" w:type="dxa"/>
+              <w:right w:w="108" w:type="dxa"/>
+            </w:tcMar>
+            <w:vAlign w:val="center"/>
+          </w:tcPr>
+          <w:p>
+            <w:pPr>
+              <w:pStyle w:val="87"/>
+              <w:ind w:left="-57" w:right="-57"/>
+              <w:jc w:val="center"/>
+            </w:pPr>
+            <w:r>
+              <w:t>Объем,</w:t>
+            </w:r>
+            <w:r>
+              <w:rPr>
+                <w:lang w:val="en-US"/>
+              </w:rPr>
+              <w:t xml:space="preserve"> </w:t>
+            </w:r>
+            <w:r>
+              <w:t>%</w:t>
+            </w:r>
+          </w:p>
+        </w:tc>
+      </w:tr>
+      <w:tr>
+        <w:tblPrEx>
+          <w:tblCellMar>
+            <w:top w:w="0" w:type="dxa"/>
+            <w:left w:w="10" w:type="dxa"/>
+            <w:bottom w:w="0" w:type="dxa"/>
+            <w:right w:w="10" w:type="dxa"/>
+          </w:tblCellMar>
+        </w:tblPrEx>
+        <w:tc>
+          <w:tcPr>
+            <w:tcW w:w="563" w:type="dxa"/>
+            <w:tcBorders>
+              <w:top w:val="single" w:color="000000" w:sz="6" w:space="0"/>
+              <w:left w:val="single" w:color="000000" w:sz="6" w:space="0"/>
+              <w:bottom w:val="single" w:color="000000" w:sz="6" w:space="0"/>
+            </w:tcBorders>
+            <w:tcMar>
+              <w:top w:w="0" w:type="dxa"/>
+              <w:left w:w="108" w:type="dxa"/>
+              <w:bottom w:w="0" w:type="dxa"/>
+              <w:right w:w="108" w:type="dxa"/>
+            </w:tcMar>
+          </w:tcPr>
+          <w:p>
+            <w:pPr>
+              <w:pStyle w:val="87"/>
+              <w:spacing w:line="240" w:lineRule="auto"/>
+              <w:jc w:val="center"/>
+            </w:pPr>
+            <w:r>
+              <w:rPr>
+                <w:sz w:val="22"/>
+              </w:rPr>
+              <w:t>1</w:t>
+            </w:r>
+          </w:p>
+        </w:tc>
+        <w:tc>
+          <w:tcPr>
+            <w:tcW w:w="6928" w:type="dxa"/>
+            <w:tcBorders>
+              <w:top w:val="single" w:color="000000" w:sz="6" w:space="0"/>
+              <w:left w:val="single" w:color="000000" w:sz="6" w:space="0"/>
+              <w:bottom w:val="single" w:color="000000" w:sz="6" w:space="0"/>
+            </w:tcBorders>
+            <w:tcMar>
+              <w:top w:w="0" w:type="dxa"/>
+              <w:left w:w="108" w:type="dxa"/>
+              <w:bottom w:w="0" w:type="dxa"/>
+              <w:right w:w="108" w:type="dxa"/>
+            </w:tcMar>
+          </w:tcPr>
+          <w:p>
+            <w:pPr>
+              <w:pStyle w:val="87"/>
+              <w:spacing w:line="240" w:lineRule="auto"/>
+            </w:pPr>
+            <w:r>
+              <w:rPr>
+                <w:sz w:val="22"/>
+              </w:rPr>
+              <w:t>M0. Аудит задания и фиксация требований</w:t>
+            </w:r>
+          </w:p>
+        </w:tc>
+        <w:tc>
+          <w:tcPr>
+            <w:tcW w:w="1440" w:type="dxa"/>
+            <w:tcBorders>
+              <w:top w:val="single" w:color="000000" w:sz="6" w:space="0"/>
+              <w:left w:val="single" w:color="000000" w:sz="6" w:space="0"/>
+              <w:bottom w:val="single" w:color="000000" w:sz="6" w:space="0"/>
+            </w:tcBorders>
+            <w:tcMar>
+              <w:top w:w="0" w:type="dxa"/>
+              <w:left w:w="108" w:type="dxa"/>
+              <w:bottom w:w="0" w:type="dxa"/>
+              <w:right w:w="108" w:type="dxa"/>
+            </w:tcMar>
+          </w:tcPr>
+          <w:p>
+            <w:pPr>
+              <w:pStyle w:val="87"/>
+              <w:jc w:val="center"/>
+              <w:rPr>
+                <w:rFonts w:eastAsia="Calibri"/>
+                <w:lang w:val="en-US" w:bidi="ar-SA"/>
+              </w:rPr>
+            </w:pPr>
+          </w:p>
+        </w:tc>
+        <w:tc>
+          <w:tcPr>
+            <w:tcW w:w="988" w:type="dxa"/>
+            <w:tcBorders>
+              <w:top w:val="single" w:color="000000" w:sz="6" w:space="0"/>
+              <w:left w:val="single" w:color="000000" w:sz="6" w:space="0"/>
+              <w:bottom w:val="single" w:color="000000" w:sz="6" w:space="0"/>
+              <w:right w:val="single" w:color="000000" w:sz="6" w:space="0"/>
+            </w:tcBorders>
+            <w:tcMar>
+              <w:top w:w="0" w:type="dxa"/>
+              <w:left w:w="108" w:type="dxa"/>
+              <w:bottom w:w="0" w:type="dxa"/>
+              <w:right w:w="108" w:type="dxa"/>
+            </w:tcMar>
+          </w:tcPr>
+          <w:p>
+            <w:pPr>
+              <w:pStyle w:val="87"/>
+              <w:jc w:val="center"/>
+            </w:pPr>
+          </w:p>
+        </w:tc>
+      </w:tr>
+      <w:tr>
+        <w:tblPrEx>
+          <w:tblCellMar>
+            <w:top w:w="0" w:type="dxa"/>
+            <w:left w:w="10" w:type="dxa"/>
+            <w:bottom w:w="0" w:type="dxa"/>
+            <w:right w:w="10" w:type="dxa"/>
+          </w:tblCellMar>
+        </w:tblPrEx>
+        <w:tc>
+          <w:tcPr>
+            <w:tcW w:w="563" w:type="dxa"/>
+            <w:tcBorders>
+              <w:left w:val="single" w:color="000000" w:sz="6" w:space="0"/>
+              <w:bottom w:val="single" w:color="000000" w:sz="6" w:space="0"/>
+            </w:tcBorders>
+            <w:tcMar>
+              <w:top w:w="0" w:type="dxa"/>
+              <w:left w:w="108" w:type="dxa"/>
+              <w:bottom w:w="0" w:type="dxa"/>
+              <w:right w:w="108" w:type="dxa"/>
+            </w:tcMar>
+          </w:tcPr>
+          <w:p>
+            <w:pPr>
+              <w:pStyle w:val="87"/>
+              <w:spacing w:line="240" w:lineRule="auto"/>
+              <w:jc w:val="center"/>
+            </w:pPr>
+            <w:r>
+              <w:rPr>
+                <w:sz w:val="22"/>
+              </w:rPr>
+              <w:t>2</w:t>
+            </w:r>
+          </w:p>
+        </w:tc>
+        <w:tc>
+          <w:tcPr>
+            <w:tcW w:w="6928" w:type="dxa"/>
+            <w:tcBorders>
+              <w:left w:val="single" w:color="000000" w:sz="6" w:space="0"/>
+              <w:bottom w:val="single" w:color="000000" w:sz="6" w:space="0"/>
+            </w:tcBorders>
+            <w:tcMar>
+              <w:top w:w="0" w:type="dxa"/>
+              <w:left w:w="108" w:type="dxa"/>
+              <w:bottom w:w="0" w:type="dxa"/>
+              <w:right w:w="108" w:type="dxa"/>
+            </w:tcMar>
+          </w:tcPr>
+          <w:p>
+            <w:pPr>
+              <w:pStyle w:val="87"/>
+              <w:spacing w:line="240" w:lineRule="auto"/>
+            </w:pPr>
+            <w:r>
+              <w:rPr>
+                <w:sz w:val="22"/>
+              </w:rPr>
+              <w:t>M1. Архитектура и выбор средств моделирования</w:t>
+            </w:r>
+          </w:p>
+        </w:tc>
+        <w:tc>
+          <w:tcPr>
+            <w:tcW w:w="1440" w:type="dxa"/>
+            <w:tcBorders>
+              <w:left w:val="single" w:color="000000" w:sz="6" w:space="0"/>
+              <w:bottom w:val="single" w:color="000000" w:sz="6" w:space="0"/>
+            </w:tcBorders>
+            <w:tcMar>
+              <w:top w:w="0" w:type="dxa"/>
+              <w:left w:w="108" w:type="dxa"/>
+              <w:bottom w:w="0" w:type="dxa"/>
+              <w:right w:w="108" w:type="dxa"/>
+            </w:tcMar>
+          </w:tcPr>
+          <w:p>
+            <w:pPr>
+              <w:pStyle w:val="87"/>
+              <w:jc w:val="center"/>
+            </w:pPr>
+          </w:p>
+        </w:tc>
+        <w:tc>
+          <w:tcPr>
+            <w:tcW w:w="988" w:type="dxa"/>
+            <w:tcBorders>
+              <w:left w:val="single" w:color="000000" w:sz="6" w:space="0"/>
+              <w:bottom w:val="single" w:color="000000" w:sz="6" w:space="0"/>
+              <w:right w:val="single" w:color="000000" w:sz="6" w:space="0"/>
+            </w:tcBorders>
+            <w:tcMar>
+              <w:top w:w="0" w:type="dxa"/>
+              <w:left w:w="108" w:type="dxa"/>
+              <w:bottom w:w="0" w:type="dxa"/>
+              <w:right w:w="108" w:type="dxa"/>
+            </w:tcMar>
+          </w:tcPr>
+          <w:p>
+            <w:pPr>
+              <w:pStyle w:val="87"/>
+              <w:jc w:val="center"/>
+            </w:pPr>
+          </w:p>
+        </w:tc>
+      </w:tr>
+      <w:tr>
+        <w:tblPrEx>
+          <w:tblCellMar>
+            <w:top w:w="0" w:type="dxa"/>
+            <w:left w:w="10" w:type="dxa"/>
+            <w:bottom w:w="0" w:type="dxa"/>
+            <w:right w:w="10" w:type="dxa"/>
+          </w:tblCellMar>
+        </w:tblPrEx>
+        <w:tc>
+          <w:tcPr>
+            <w:tcW w:w="563" w:type="dxa"/>
+            <w:tcBorders>
+              <w:top w:val="single" w:color="000000" w:sz="6" w:space="0"/>
+              <w:left w:val="single" w:color="000000" w:sz="6" w:space="0"/>
+              <w:bottom w:val="single" w:color="000000" w:sz="6" w:space="0"/>
+            </w:tcBorders>
+            <w:tcMar>
+              <w:top w:w="0" w:type="dxa"/>
+              <w:left w:w="108" w:type="dxa"/>
+              <w:bottom w:w="0" w:type="dxa"/>
+              <w:right w:w="108" w:type="dxa"/>
+            </w:tcMar>
+          </w:tcPr>
+          <w:p>
+            <w:pPr>
+              <w:pStyle w:val="87"/>
+              <w:spacing w:line="240" w:lineRule="auto"/>
+              <w:jc w:val="center"/>
+            </w:pPr>
+            <w:r>
+              <w:rPr>
+                <w:sz w:val="22"/>
+              </w:rPr>
+              <w:t>3</w:t>
+            </w:r>
+          </w:p>
+        </w:tc>
+        <w:tc>
+          <w:tcPr>
+            <w:tcW w:w="6928" w:type="dxa"/>
+            <w:tcBorders>
+              <w:top w:val="single" w:color="000000" w:sz="6" w:space="0"/>
+              <w:left w:val="single" w:color="000000" w:sz="6" w:space="0"/>
+              <w:bottom w:val="single" w:color="000000" w:sz="6" w:space="0"/>
+            </w:tcBorders>
+            <w:tcMar>
+              <w:top w:w="0" w:type="dxa"/>
+              <w:left w:w="108" w:type="dxa"/>
+              <w:bottom w:w="0" w:type="dxa"/>
+              <w:right w:w="108" w:type="dxa"/>
+            </w:tcMar>
+          </w:tcPr>
+          <w:p>
+            <w:pPr>
+              <w:pStyle w:val="87"/>
+              <w:tabs>
+                <w:tab w:val="left" w:pos="310"/>
+              </w:tabs>
+              <w:spacing w:line="240" w:lineRule="auto"/>
+            </w:pPr>
+            <w:r>
+              <w:rPr>
+                <w:sz w:val="22"/>
+              </w:rPr>
+              <w:t>M2. Геометрия модели и единая спецификация параметров</w:t>
+            </w:r>
+          </w:p>
+        </w:tc>
+        <w:tc>
+          <w:tcPr>
+            <w:tcW w:w="1440" w:type="dxa"/>
+            <w:tcBorders>
+              <w:top w:val="single" w:color="000000" w:sz="6" w:space="0"/>
+              <w:left w:val="single" w:color="000000" w:sz="6" w:space="0"/>
+              <w:bottom w:val="single" w:color="000000" w:sz="6" w:space="0"/>
+            </w:tcBorders>
+            <w:tcMar>
+              <w:top w:w="0" w:type="dxa"/>
+              <w:left w:w="108" w:type="dxa"/>
+              <w:bottom w:w="0" w:type="dxa"/>
+              <w:right w:w="108" w:type="dxa"/>
+            </w:tcMar>
+          </w:tcPr>
+          <w:p>
+            <w:pPr>
+              <w:pStyle w:val="87"/>
+              <w:jc w:val="center"/>
+            </w:pPr>
+          </w:p>
+        </w:tc>
+        <w:tc>
+          <w:tcPr>
+            <w:tcW w:w="988" w:type="dxa"/>
+            <w:tcBorders>
+              <w:top w:val="single" w:color="000000" w:sz="6" w:space="0"/>
+              <w:left w:val="single" w:color="000000" w:sz="6" w:space="0"/>
+              <w:bottom w:val="single" w:color="000000" w:sz="6" w:space="0"/>
+              <w:right w:val="single" w:color="000000" w:sz="6" w:space="0"/>
+            </w:tcBorders>
+            <w:tcMar>
+              <w:top w:w="0" w:type="dxa"/>
+              <w:left w:w="108" w:type="dxa"/>
+              <w:bottom w:w="0" w:type="dxa"/>
+              <w:right w:w="108" w:type="dxa"/>
+            </w:tcMar>
+          </w:tcPr>
+          <w:p>
+            <w:pPr>
+              <w:pStyle w:val="87"/>
+              <w:jc w:val="center"/>
+            </w:pPr>
+          </w:p>
+        </w:tc>
+      </w:tr>
+      <w:tr>
+        <w:tblPrEx>
+          <w:tblCellMar>
+            <w:top w:w="0" w:type="dxa"/>
+            <w:left w:w="10" w:type="dxa"/>
+            <w:bottom w:w="0" w:type="dxa"/>
+            <w:right w:w="10" w:type="dxa"/>
+          </w:tblCellMar>
+        </w:tblPrEx>
+        <w:tc>
+          <w:tcPr>
+            <w:tcW w:w="563" w:type="dxa"/>
+            <w:tcBorders>
+              <w:left w:val="single" w:color="000000" w:sz="6" w:space="0"/>
+              <w:bottom w:val="single" w:color="000000" w:sz="6" w:space="0"/>
+            </w:tcBorders>
+            <w:tcMar>
+              <w:top w:w="0" w:type="dxa"/>
+              <w:left w:w="108" w:type="dxa"/>
+              <w:bottom w:w="0" w:type="dxa"/>
+              <w:right w:w="108" w:type="dxa"/>
+            </w:tcMar>
+          </w:tcPr>
+          <w:p>
+            <w:pPr>
+              <w:pStyle w:val="87"/>
+              <w:spacing w:line="240" w:lineRule="auto"/>
+              <w:jc w:val="center"/>
+            </w:pPr>
+            <w:r>
+              <w:rPr>
+                <w:sz w:val="22"/>
+              </w:rPr>
+              <w:t>4</w:t>
+            </w:r>
+          </w:p>
+        </w:tc>
+        <w:tc>
+          <w:tcPr>
+            <w:tcW w:w="6928" w:type="dxa"/>
+            <w:tcBorders>
+              <w:left w:val="single" w:color="000000" w:sz="6" w:space="0"/>
+              <w:bottom w:val="single" w:color="000000" w:sz="6" w:space="0"/>
+            </w:tcBorders>
+            <w:tcMar>
+              <w:top w:w="0" w:type="dxa"/>
+              <w:left w:w="108" w:type="dxa"/>
+              <w:bottom w:w="0" w:type="dxa"/>
+              <w:right w:w="108" w:type="dxa"/>
+            </w:tcMar>
+          </w:tcPr>
+          <w:p>
+            <w:pPr>
+              <w:pStyle w:val="87"/>
+              <w:tabs>
+                <w:tab w:val="left" w:pos="310"/>
+              </w:tabs>
+              <w:spacing w:line="240" w:lineRule="auto"/>
+            </w:pPr>
+            <w:r>
+              <w:rPr>
+                <w:sz w:val="22"/>
+              </w:rPr>
+              <w:t>M3. Прямая и обратная кинематика</w:t>
+            </w:r>
+          </w:p>
+        </w:tc>
+        <w:tc>
+          <w:tcPr>
+            <w:tcW w:w="1440" w:type="dxa"/>
+            <w:tcBorders>
+              <w:left w:val="single" w:color="000000" w:sz="6" w:space="0"/>
+              <w:bottom w:val="single" w:color="000000" w:sz="6" w:space="0"/>
+            </w:tcBorders>
+            <w:tcMar>
+              <w:top w:w="0" w:type="dxa"/>
+              <w:left w:w="108" w:type="dxa"/>
+              <w:bottom w:w="0" w:type="dxa"/>
+              <w:right w:w="108" w:type="dxa"/>
+            </w:tcMar>
+          </w:tcPr>
+          <w:p>
+            <w:pPr>
+              <w:pStyle w:val="87"/>
+              <w:jc w:val="center"/>
+              <w:rPr>
+                <w:rFonts w:eastAsia="Calibri"/>
+                <w:lang w:bidi="ar-SA"/>
+              </w:rPr>
+            </w:pPr>
+          </w:p>
+        </w:tc>
+        <w:tc>
+          <w:tcPr>
+            <w:tcW w:w="988" w:type="dxa"/>
+            <w:tcBorders>
+              <w:left w:val="single" w:color="000000" w:sz="6" w:space="0"/>
+              <w:bottom w:val="single" w:color="000000" w:sz="6" w:space="0"/>
+              <w:right w:val="single" w:color="000000" w:sz="6" w:space="0"/>
+            </w:tcBorders>
+            <w:tcMar>
+              <w:top w:w="0" w:type="dxa"/>
+              <w:left w:w="108" w:type="dxa"/>
+              <w:bottom w:w="0" w:type="dxa"/>
+              <w:right w:w="108" w:type="dxa"/>
+            </w:tcMar>
+          </w:tcPr>
+          <w:p>
+            <w:pPr>
+              <w:pStyle w:val="87"/>
+              <w:jc w:val="center"/>
+            </w:pPr>
+          </w:p>
+        </w:tc>
+      </w:tr>
+      <w:tr>
+        <w:tblPrEx>
+          <w:tblCellMar>
+            <w:top w:w="0" w:type="dxa"/>
+            <w:left w:w="10" w:type="dxa"/>
+            <w:bottom w:w="0" w:type="dxa"/>
+            <w:right w:w="10" w:type="dxa"/>
+          </w:tblCellMar>
+        </w:tblPrEx>
+        <w:tc>
+          <w:tcPr>
+            <w:tcW w:w="563" w:type="dxa"/>
+            <w:tcBorders>
+              <w:top w:val="single" w:color="000000" w:sz="6" w:space="0"/>
+              <w:left w:val="single" w:color="000000" w:sz="6" w:space="0"/>
+              <w:bottom w:val="single" w:color="000000" w:sz="6" w:space="0"/>
+            </w:tcBorders>
+            <w:tcMar>
+              <w:top w:w="0" w:type="dxa"/>
+              <w:left w:w="108" w:type="dxa"/>
+              <w:bottom w:w="0" w:type="dxa"/>
+              <w:right w:w="108" w:type="dxa"/>
+            </w:tcMar>
+          </w:tcPr>
+          <w:p>
+            <w:pPr>
+              <w:pStyle w:val="87"/>
+              <w:spacing w:line="240" w:lineRule="auto"/>
+              <w:jc w:val="center"/>
+            </w:pPr>
+            <w:r>
+              <w:rPr>
+                <w:sz w:val="22"/>
+              </w:rPr>
+              <w:t>5</w:t>
+            </w:r>
+          </w:p>
+        </w:tc>
+        <w:tc>
+          <w:tcPr>
+            <w:tcW w:w="6928" w:type="dxa"/>
+            <w:tcBorders>
+              <w:top w:val="single" w:color="000000" w:sz="6" w:space="0"/>
+              <w:left w:val="single" w:color="000000" w:sz="6" w:space="0"/>
+              <w:bottom w:val="single" w:color="000000" w:sz="6" w:space="0"/>
+            </w:tcBorders>
+            <w:tcMar>
+              <w:top w:w="0" w:type="dxa"/>
+              <w:left w:w="108" w:type="dxa"/>
+              <w:bottom w:w="0" w:type="dxa"/>
+              <w:right w:w="108" w:type="dxa"/>
+            </w:tcMar>
+          </w:tcPr>
+          <w:p>
+            <w:pPr>
+              <w:pStyle w:val="87"/>
+              <w:spacing w:line="240" w:lineRule="auto"/>
+            </w:pPr>
+            <w:r>
+              <w:rPr>
+                <w:sz w:val="22"/>
+              </w:rPr>
+              <w:t>M4. Компьютерное зрение и определение положения объектов</w:t>
+            </w:r>
+          </w:p>
+        </w:tc>
+        <w:tc>
+          <w:tcPr>
+            <w:tcW w:w="1440" w:type="dxa"/>
+            <w:tcBorders>
+              <w:top w:val="single" w:color="000000" w:sz="6" w:space="0"/>
+              <w:left w:val="single" w:color="000000" w:sz="6" w:space="0"/>
+              <w:bottom w:val="single" w:color="000000" w:sz="6" w:space="0"/>
+            </w:tcBorders>
+            <w:tcMar>
+              <w:top w:w="0" w:type="dxa"/>
+              <w:left w:w="108" w:type="dxa"/>
+              <w:bottom w:w="0" w:type="dxa"/>
+              <w:right w:w="108" w:type="dxa"/>
+            </w:tcMar>
+          </w:tcPr>
+          <w:p>
+            <w:pPr>
+              <w:pStyle w:val="87"/>
+              <w:jc w:val="center"/>
+              <w:rPr>
+                <w:rFonts w:eastAsia="Calibri"/>
+                <w:lang w:bidi="ar-SA"/>
+              </w:rPr>
+            </w:pPr>
+          </w:p>
+        </w:tc>
+        <w:tc>
+          <w:tcPr>
+            <w:tcW w:w="988" w:type="dxa"/>
+            <w:tcBorders>
+              <w:top w:val="single" w:color="000000" w:sz="6" w:space="0"/>
+              <w:left w:val="single" w:color="000000" w:sz="6" w:space="0"/>
+              <w:bottom w:val="single" w:color="000000" w:sz="6" w:space="0"/>
+              <w:right w:val="single" w:color="000000" w:sz="6" w:space="0"/>
+            </w:tcBorders>
+            <w:tcMar>
+              <w:top w:w="0" w:type="dxa"/>
+              <w:left w:w="108" w:type="dxa"/>
+              <w:bottom w:w="0" w:type="dxa"/>
+              <w:right w:w="108" w:type="dxa"/>
+            </w:tcMar>
+          </w:tcPr>
+          <w:p>
+            <w:pPr>
+              <w:pStyle w:val="87"/>
+              <w:jc w:val="center"/>
+            </w:pPr>
+          </w:p>
+        </w:tc>
+      </w:tr>
+      <w:tr>
+        <w:tblPrEx>
+          <w:tblCellMar>
+            <w:top w:w="0" w:type="dxa"/>
+            <w:left w:w="10" w:type="dxa"/>
+            <w:bottom w:w="0" w:type="dxa"/>
+            <w:right w:w="10" w:type="dxa"/>
+          </w:tblCellMar>
+        </w:tblPrEx>
+        <w:tc>
+          <w:tcPr>
+            <w:tcW w:w="563" w:type="dxa"/>
+            <w:tcBorders>
+              <w:left w:val="single" w:color="000000" w:sz="6" w:space="0"/>
+              <w:bottom w:val="single" w:color="000000" w:sz="6" w:space="0"/>
+            </w:tcBorders>
+            <w:tcMar>
+              <w:top w:w="0" w:type="dxa"/>
+              <w:left w:w="108" w:type="dxa"/>
+              <w:bottom w:w="0" w:type="dxa"/>
+              <w:right w:w="108" w:type="dxa"/>
+            </w:tcMar>
+          </w:tcPr>
+          <w:p>
+            <w:pPr>
+              <w:pStyle w:val="87"/>
+              <w:spacing w:line="240" w:lineRule="auto"/>
+              <w:jc w:val="center"/>
+            </w:pPr>
+            <w:r>
+              <w:rPr>
+                <w:sz w:val="22"/>
+              </w:rPr>
+              <w:t>6</w:t>
+            </w:r>
+          </w:p>
+        </w:tc>
+        <w:tc>
+          <w:tcPr>
+            <w:tcW w:w="6928" w:type="dxa"/>
+            <w:tcBorders>
+              <w:left w:val="single" w:color="000000" w:sz="6" w:space="0"/>
+              <w:bottom w:val="single" w:color="000000" w:sz="6" w:space="0"/>
+            </w:tcBorders>
+            <w:tcMar>
+              <w:top w:w="0" w:type="dxa"/>
+              <w:left w:w="108" w:type="dxa"/>
+              <w:bottom w:w="0" w:type="dxa"/>
+              <w:right w:w="108" w:type="dxa"/>
+            </w:tcMar>
+          </w:tcPr>
+          <w:p>
+            <w:pPr>
+              <w:pStyle w:val="87"/>
+              <w:spacing w:line="240" w:lineRule="auto"/>
+            </w:pPr>
+            <w:r>
+              <w:rPr>
+                <w:sz w:val="22"/>
+              </w:rPr>
+              <w:t>M5. Планирование траекторий и проверка столкновений</w:t>
+            </w:r>
+          </w:p>
+        </w:tc>
+        <w:tc>
+          <w:tcPr>
+            <w:tcW w:w="1440" w:type="dxa"/>
+            <w:tcBorders>
+              <w:left w:val="single" w:color="000000" w:sz="6" w:space="0"/>
+              <w:bottom w:val="single" w:color="000000" w:sz="6" w:space="0"/>
+            </w:tcBorders>
+            <w:tcMar>
+              <w:top w:w="0" w:type="dxa"/>
+              <w:left w:w="108" w:type="dxa"/>
+              <w:bottom w:w="0" w:type="dxa"/>
+              <w:right w:w="108" w:type="dxa"/>
+            </w:tcMar>
+          </w:tcPr>
+          <w:p>
+            <w:pPr>
+              <w:pStyle w:val="87"/>
+              <w:jc w:val="center"/>
+              <w:rPr>
+                <w:rFonts w:eastAsia="Calibri"/>
+                <w:lang w:bidi="ar-SA"/>
+              </w:rPr>
+            </w:pPr>
+          </w:p>
+        </w:tc>
+        <w:tc>
+          <w:tcPr>
+            <w:tcW w:w="988" w:type="dxa"/>
+            <w:tcBorders>
+              <w:left w:val="single" w:color="000000" w:sz="6" w:space="0"/>
+              <w:bottom w:val="single" w:color="000000" w:sz="6" w:space="0"/>
+              <w:right w:val="single" w:color="000000" w:sz="6" w:space="0"/>
+            </w:tcBorders>
+            <w:tcMar>
+              <w:top w:w="0" w:type="dxa"/>
+              <w:left w:w="108" w:type="dxa"/>
+              <w:bottom w:w="0" w:type="dxa"/>
+              <w:right w:w="108" w:type="dxa"/>
+            </w:tcMar>
+          </w:tcPr>
+          <w:p>
+            <w:pPr>
+              <w:pStyle w:val="87"/>
+              <w:jc w:val="center"/>
+            </w:pPr>
+          </w:p>
+        </w:tc>
+      </w:tr>
+      <w:tr>
+        <w:tblPrEx>
+          <w:tblCellMar>
+            <w:top w:w="0" w:type="dxa"/>
+            <w:left w:w="10" w:type="dxa"/>
+            <w:bottom w:w="0" w:type="dxa"/>
+            <w:right w:w="10" w:type="dxa"/>
+          </w:tblCellMar>
+        </w:tblPrEx>
+        <w:tc>
+          <w:tcPr>
+            <w:tcW w:w="563" w:type="dxa"/>
+            <w:tcBorders>
+              <w:left w:val="single" w:color="000000" w:sz="6" w:space="0"/>
+              <w:bottom w:val="single" w:color="000000" w:sz="6" w:space="0"/>
+            </w:tcBorders>
+            <w:tcMar>
+              <w:top w:w="0" w:type="dxa"/>
+              <w:left w:w="108" w:type="dxa"/>
+              <w:bottom w:w="0" w:type="dxa"/>
+              <w:right w:w="108" w:type="dxa"/>
+            </w:tcMar>
+          </w:tcPr>
+          <w:p>
+            <w:pPr>
+              <w:pStyle w:val="87"/>
+              <w:spacing w:line="240" w:lineRule="auto"/>
+              <w:jc w:val="center"/>
+            </w:pPr>
+            <w:r>
+              <w:rPr>
+                <w:sz w:val="22"/>
+              </w:rPr>
+              <w:t>7</w:t>
+            </w:r>
+          </w:p>
+        </w:tc>
+        <w:tc>
+          <w:tcPr>
+            <w:tcW w:w="6928" w:type="dxa"/>
+            <w:tcBorders>
+              <w:left w:val="single" w:color="000000" w:sz="6" w:space="0"/>
+              <w:bottom w:val="single" w:color="000000" w:sz="6" w:space="0"/>
+            </w:tcBorders>
+            <w:tcMar>
+              <w:top w:w="0" w:type="dxa"/>
+              <w:left w:w="108" w:type="dxa"/>
+              <w:bottom w:w="0" w:type="dxa"/>
+              <w:right w:w="108" w:type="dxa"/>
+            </w:tcMar>
+          </w:tcPr>
+          <w:p>
+            <w:pPr>
+              <w:pStyle w:val="87"/>
+              <w:spacing w:line="240" w:lineRule="auto"/>
+            </w:pPr>
+            <w:r>
+              <w:rPr>
+                <w:sz w:val="22"/>
+              </w:rPr>
+              <w:t>M6. Алгоритм сортировки и конечный автомат</w:t>
+            </w:r>
+          </w:p>
+        </w:tc>
+        <w:tc>
+          <w:tcPr>
+            <w:tcW w:w="1440" w:type="dxa"/>
+            <w:tcBorders>
+              <w:left w:val="single" w:color="000000" w:sz="6" w:space="0"/>
+              <w:bottom w:val="single" w:color="000000" w:sz="6" w:space="0"/>
+            </w:tcBorders>
+            <w:tcMar>
+              <w:top w:w="0" w:type="dxa"/>
+              <w:left w:w="108" w:type="dxa"/>
+              <w:bottom w:w="0" w:type="dxa"/>
+              <w:right w:w="108" w:type="dxa"/>
+            </w:tcMar>
+          </w:tcPr>
+          <w:p>
+            <w:pPr>
+              <w:pStyle w:val="87"/>
+              <w:jc w:val="center"/>
+              <w:rPr>
+                <w:rFonts w:eastAsia="Calibri"/>
+                <w:lang w:bidi="ar-SA"/>
+              </w:rPr>
+            </w:pPr>
+          </w:p>
+        </w:tc>
+        <w:tc>
+          <w:tcPr>
+            <w:tcW w:w="988" w:type="dxa"/>
+            <w:tcBorders>
+              <w:left w:val="single" w:color="000000" w:sz="6" w:space="0"/>
+              <w:bottom w:val="single" w:color="000000" w:sz="6" w:space="0"/>
+              <w:right w:val="single" w:color="000000" w:sz="6" w:space="0"/>
+            </w:tcBorders>
+            <w:tcMar>
+              <w:top w:w="0" w:type="dxa"/>
+              <w:left w:w="108" w:type="dxa"/>
+              <w:bottom w:w="0" w:type="dxa"/>
+              <w:right w:w="108" w:type="dxa"/>
+            </w:tcMar>
+          </w:tcPr>
+          <w:p>
+            <w:pPr>
+              <w:pStyle w:val="87"/>
+              <w:jc w:val="center"/>
+            </w:pPr>
+          </w:p>
+        </w:tc>
+      </w:tr>
+      <w:tr>
+        <w:tblPrEx>
+          <w:tblCellMar>
+            <w:top w:w="0" w:type="dxa"/>
+            <w:left w:w="10" w:type="dxa"/>
+            <w:bottom w:w="0" w:type="dxa"/>
+            <w:right w:w="10" w:type="dxa"/>
+          </w:tblCellMar>
+        </w:tblPrEx>
+        <w:tc>
+          <w:tcPr>
+            <w:tcW w:w="563" w:type="dxa"/>
+            <w:tcBorders>
+              <w:left w:val="single" w:color="000000" w:sz="6" w:space="0"/>
+              <w:bottom w:val="single" w:color="000000" w:sz="6" w:space="0"/>
+            </w:tcBorders>
+            <w:tcMar>
+              <w:top w:w="0" w:type="dxa"/>
+              <w:left w:w="108" w:type="dxa"/>
+              <w:bottom w:w="0" w:type="dxa"/>
+              <w:right w:w="108" w:type="dxa"/>
+            </w:tcMar>
+          </w:tcPr>
+          <w:p>
+            <w:pPr>
+              <w:pStyle w:val="87"/>
+              <w:spacing w:line="240" w:lineRule="auto"/>
+              <w:jc w:val="center"/>
+            </w:pPr>
+            <w:r>
+              <w:rPr>
+                <w:sz w:val="22"/>
+              </w:rPr>
+              <w:t>8</w:t>
+            </w:r>
+          </w:p>
+        </w:tc>
+        <w:tc>
+          <w:tcPr>
+            <w:tcW w:w="6928" w:type="dxa"/>
+            <w:tcBorders>
+              <w:left w:val="single" w:color="000000" w:sz="6" w:space="0"/>
+              <w:bottom w:val="single" w:color="000000" w:sz="6" w:space="0"/>
+            </w:tcBorders>
+            <w:tcMar>
+              <w:top w:w="0" w:type="dxa"/>
+              <w:left w:w="108" w:type="dxa"/>
+              <w:bottom w:w="0" w:type="dxa"/>
+              <w:right w:w="108" w:type="dxa"/>
+            </w:tcMar>
+          </w:tcPr>
+          <w:p>
+            <w:pPr>
+              <w:pStyle w:val="87"/>
+              <w:spacing w:line="240" w:lineRule="auto"/>
+            </w:pPr>
+            <w:r>
+              <w:rPr>
+                <w:sz w:val="22"/>
+              </w:rPr>
+              <w:t>M7–M8. Интеграция физической модели, визуализация и видео</w:t>
+            </w:r>
+          </w:p>
+        </w:tc>
+        <w:tc>
+          <w:tcPr>
+            <w:tcW w:w="1440" w:type="dxa"/>
+            <w:tcBorders>
+              <w:left w:val="single" w:color="000000" w:sz="6" w:space="0"/>
+              <w:bottom w:val="single" w:color="000000" w:sz="6" w:space="0"/>
+            </w:tcBorders>
+            <w:tcMar>
+              <w:top w:w="0" w:type="dxa"/>
+              <w:left w:w="108" w:type="dxa"/>
+              <w:bottom w:w="0" w:type="dxa"/>
+              <w:right w:w="108" w:type="dxa"/>
+            </w:tcMar>
+          </w:tcPr>
+          <w:p>
+            <w:pPr>
+              <w:pStyle w:val="87"/>
+              <w:jc w:val="center"/>
+              <w:rPr>
+                <w:rFonts w:eastAsia="Calibri"/>
+                <w:lang w:bidi="ar-SA"/>
+              </w:rPr>
+            </w:pPr>
+          </w:p>
+        </w:tc>
+        <w:tc>
+          <w:tcPr>
+            <w:tcW w:w="988" w:type="dxa"/>
+            <w:tcBorders>
+              <w:left w:val="single" w:color="000000" w:sz="6" w:space="0"/>
+              <w:bottom w:val="single" w:color="000000" w:sz="6" w:space="0"/>
+              <w:right w:val="single" w:color="000000" w:sz="6" w:space="0"/>
+            </w:tcBorders>
+            <w:tcMar>
+              <w:top w:w="0" w:type="dxa"/>
+              <w:left w:w="108" w:type="dxa"/>
+              <w:bottom w:w="0" w:type="dxa"/>
+              <w:right w:w="108" w:type="dxa"/>
+            </w:tcMar>
+          </w:tcPr>
+          <w:p>
+            <w:pPr>
+              <w:pStyle w:val="87"/>
+              <w:jc w:val="center"/>
+            </w:pPr>
+          </w:p>
+        </w:tc>
+      </w:tr>
+      <w:tr>
+        <w:tblPrEx>
+          <w:tblCellMar>
+            <w:top w:w="0" w:type="dxa"/>
+            <w:left w:w="10" w:type="dxa"/>
+            <w:bottom w:w="0" w:type="dxa"/>
+            <w:right w:w="10" w:type="dxa"/>
+          </w:tblCellMar>
+        </w:tblPrEx>
+        <w:tc>
+          <w:tcPr>
+            <w:tcW w:w="563" w:type="dxa"/>
+            <w:tcBorders>
+              <w:left w:val="single" w:color="000000" w:sz="6" w:space="0"/>
+              <w:bottom w:val="single" w:color="000000" w:sz="6" w:space="0"/>
+            </w:tcBorders>
+            <w:tcMar>
+              <w:top w:w="0" w:type="dxa"/>
+              <w:left w:w="108" w:type="dxa"/>
+              <w:bottom w:w="0" w:type="dxa"/>
+              <w:right w:w="108" w:type="dxa"/>
+            </w:tcMar>
+          </w:tcPr>
+          <w:p>
+            <w:pPr>
+              <w:pStyle w:val="87"/>
+              <w:spacing w:line="240" w:lineRule="auto"/>
+              <w:jc w:val="center"/>
+            </w:pPr>
+            <w:r>
+              <w:rPr>
+                <w:sz w:val="22"/>
+              </w:rPr>
+              <w:t>9</w:t>
+            </w:r>
+          </w:p>
+        </w:tc>
+        <w:tc>
+          <w:tcPr>
+            <w:tcW w:w="6928" w:type="dxa"/>
+            <w:tcBorders>
+              <w:left w:val="single" w:color="000000" w:sz="6" w:space="0"/>
+              <w:bottom w:val="single" w:color="000000" w:sz="6" w:space="0"/>
+            </w:tcBorders>
+            <w:tcMar>
+              <w:top w:w="0" w:type="dxa"/>
+              <w:left w:w="108" w:type="dxa"/>
+              <w:bottom w:w="0" w:type="dxa"/>
+              <w:right w:w="108" w:type="dxa"/>
+            </w:tcMar>
+          </w:tcPr>
+          <w:p>
+            <w:pPr>
+              <w:pStyle w:val="87"/>
+              <w:spacing w:line="240" w:lineRule="auto"/>
+            </w:pPr>
+            <w:r>
+              <w:rPr>
+                <w:sz w:val="22"/>
+              </w:rPr>
+              <w:t>M9. Виртуальные испытания и анализ результатов</w:t>
+            </w:r>
+          </w:p>
+        </w:tc>
+        <w:tc>
+          <w:tcPr>
+            <w:tcW w:w="1440" w:type="dxa"/>
+            <w:tcBorders>
+              <w:left w:val="single" w:color="000000" w:sz="6" w:space="0"/>
+              <w:bottom w:val="single" w:color="000000" w:sz="6" w:space="0"/>
+            </w:tcBorders>
+            <w:tcMar>
+              <w:top w:w="0" w:type="dxa"/>
+              <w:left w:w="108" w:type="dxa"/>
+              <w:bottom w:w="0" w:type="dxa"/>
+              <w:right w:w="108" w:type="dxa"/>
+            </w:tcMar>
+          </w:tcPr>
+          <w:p>
+            <w:pPr>
+              <w:pStyle w:val="87"/>
+              <w:jc w:val="center"/>
+              <w:rPr>
+                <w:rFonts w:eastAsia="Calibri"/>
+                <w:lang w:bidi="ar-SA"/>
+              </w:rPr>
+            </w:pPr>
+          </w:p>
+        </w:tc>
+        <w:tc>
+          <w:tcPr>
+            <w:tcW w:w="988" w:type="dxa"/>
+            <w:tcBorders>
+              <w:left w:val="single" w:color="000000" w:sz="6" w:space="0"/>
+              <w:bottom w:val="single" w:color="000000" w:sz="6" w:space="0"/>
+              <w:right w:val="single" w:color="000000" w:sz="6" w:space="0"/>
+            </w:tcBorders>
+            <w:tcMar>
+              <w:top w:w="0" w:type="dxa"/>
+              <w:left w:w="108" w:type="dxa"/>
+              <w:bottom w:w="0" w:type="dxa"/>
+              <w:right w:w="108" w:type="dxa"/>
+            </w:tcMar>
+          </w:tcPr>
+          <w:p>
+            <w:pPr>
+              <w:pStyle w:val="87"/>
+              <w:jc w:val="center"/>
+            </w:pPr>
+          </w:p>
+        </w:tc>
+      </w:tr>
+      <w:tr>
+        <w:tblPrEx>
+          <w:tblCellMar>
+            <w:top w:w="0" w:type="dxa"/>
+            <w:left w:w="10" w:type="dxa"/>
+            <w:bottom w:w="0" w:type="dxa"/>
+            <w:right w:w="10" w:type="dxa"/>
+          </w:tblCellMar>
+        </w:tblPrEx>
+        <w:tc>
+          <w:tcPr>
+            <w:tcW w:w="563" w:type="dxa"/>
+            <w:tcBorders>
+              <w:top w:val="single" w:color="000000" w:sz="6" w:space="0"/>
+              <w:left w:val="single" w:color="000000" w:sz="6" w:space="0"/>
+              <w:bottom w:val="single" w:color="000000" w:sz="6" w:space="0"/>
+            </w:tcBorders>
+            <w:tcMar>
+              <w:top w:w="0" w:type="dxa"/>
+              <w:left w:w="108" w:type="dxa"/>
+              <w:bottom w:w="0" w:type="dxa"/>
+              <w:right w:w="108" w:type="dxa"/>
+            </w:tcMar>
+          </w:tcPr>
+          <w:p>
+            <w:pPr>
+              <w:pStyle w:val="87"/>
+              <w:spacing w:line="240" w:lineRule="auto"/>
+              <w:jc w:val="center"/>
+            </w:pPr>
+            <w:r>
+              <w:rPr>
+                <w:sz w:val="22"/>
+              </w:rPr>
+              <w:t>10</w:t>
+            </w:r>
+          </w:p>
+        </w:tc>
+        <w:tc>
+          <w:tcPr>
+            <w:tcW w:w="6928" w:type="dxa"/>
+            <w:tcBorders>
+              <w:top w:val="single" w:color="000000" w:sz="6" w:space="0"/>
+              <w:left w:val="single" w:color="000000" w:sz="6" w:space="0"/>
+              <w:bottom w:val="single" w:color="000000" w:sz="6" w:space="0"/>
+            </w:tcBorders>
+            <w:tcMar>
+              <w:top w:w="0" w:type="dxa"/>
+              <w:left w:w="108" w:type="dxa"/>
+              <w:bottom w:w="0" w:type="dxa"/>
+              <w:right w:w="108" w:type="dxa"/>
+            </w:tcMar>
+          </w:tcPr>
+          <w:p>
+            <w:pPr>
+              <w:pStyle w:val="87"/>
+              <w:spacing w:line="240" w:lineRule="auto"/>
+            </w:pPr>
+            <w:r>
+              <w:rPr>
+                <w:sz w:val="22"/>
+              </w:rPr>
+              <w:t>M10–M12. Записка, презентация и финальная приемка</w:t>
+            </w:r>
+          </w:p>
+        </w:tc>
+        <w:tc>
+          <w:tcPr>
+            <w:tcW w:w="1440" w:type="dxa"/>
+            <w:tcBorders>
+              <w:top w:val="single" w:color="000000" w:sz="6" w:space="0"/>
+              <w:left w:val="single" w:color="000000" w:sz="6" w:space="0"/>
+              <w:bottom w:val="single" w:color="000000" w:sz="6" w:space="0"/>
+            </w:tcBorders>
+            <w:tcMar>
+              <w:top w:w="0" w:type="dxa"/>
+              <w:left w:w="108" w:type="dxa"/>
+              <w:bottom w:w="0" w:type="dxa"/>
+              <w:right w:w="108" w:type="dxa"/>
+            </w:tcMar>
+          </w:tcPr>
+          <w:p>
+            <w:pPr>
+              <w:pStyle w:val="87"/>
+              <w:jc w:val="center"/>
+            </w:pPr>
+          </w:p>
+        </w:tc>
+        <w:tc>
+          <w:tcPr>
+            <w:tcW w:w="988" w:type="dxa"/>
+            <w:tcBorders>
+              <w:top w:val="single" w:color="000000" w:sz="6" w:space="0"/>
+              <w:left w:val="single" w:color="000000" w:sz="6" w:space="0"/>
+              <w:bottom w:val="single" w:color="000000" w:sz="6" w:space="0"/>
+              <w:right w:val="single" w:color="000000" w:sz="6" w:space="0"/>
+            </w:tcBorders>
+            <w:tcMar>
+              <w:top w:w="0" w:type="dxa"/>
+              <w:left w:w="108" w:type="dxa"/>
+              <w:bottom w:w="0" w:type="dxa"/>
+              <w:right w:w="108" w:type="dxa"/>
+            </w:tcMar>
+          </w:tcPr>
+          <w:p>
+            <w:pPr>
+              <w:pStyle w:val="87"/>
+              <w:jc w:val="center"/>
+            </w:pPr>
+          </w:p>
+        </w:tc>
+      </w:tr>
+    </w:tbl>
+    <w:p>
+      <w:pPr>
+        <w:spacing w:line="360" w:lineRule="auto"/>
+        <w:jc w:val="left"/>
+        <w:rPr>
+          <w:rFonts w:ascii="Times New Roman" w:hAnsi="Times New Roman"/>
+          <w:sz w:val="24"/>
+        </w:rPr>
+      </w:pPr>
+    </w:p>
+    <w:p>
+      <w:pPr>
+        <w:pStyle w:val="87"/>
+      </w:pPr>
+      <w:r>
+        <w:t>С графиком ознакомлен  «____» _________________ 20___ г.</w:t>
+      </w:r>
+    </w:p>
+    <w:p>
+      <w:pPr>
+        <w:rPr>
+          <w:rFonts w:ascii="Times New Roman" w:hAnsi="Times New Roman"/>
+          <w:sz w:val="24"/>
+        </w:rPr>
+      </w:pPr>
+      <w:r>
+        <w:rPr>
+          <w:rFonts w:ascii="Times New Roman" w:hAnsi="Times New Roman"/>
+          <w:b/>
+          <w:color w:val="000000"/>
+          <w:sz w:val="24"/>
+        </w:rPr>
+        <w:t>Шатуев Р.С. _______________________, обучающийся группы ДИНРб-31</w:t>
+      </w:r>
+    </w:p>
+    <w:p>
+      <w:pPr>
+        <w:rPr>
+          <w:rFonts w:ascii="Times New Roman" w:hAnsi="Times New Roman"/>
+          <w:szCs w:val="16"/>
+        </w:rPr>
+      </w:pPr>
+      <w:r>
+        <w:rPr>
+          <w:rFonts w:ascii="Times New Roman" w:hAnsi="Times New Roman"/>
+          <w:szCs w:val="16"/>
+        </w:rPr>
+        <w:t>(фамилия, инициалы, подпись)</w:t>
+      </w:r>
+    </w:p>
+    <w:p>
+      <w:pPr>
+        <w:spacing w:line="360" w:lineRule="auto"/>
+        <w:jc w:val="left"/>
+        <w:rPr>
+          <w:rFonts w:ascii="Times New Roman" w:hAnsi="Times New Roman"/>
+          <w:sz w:val="24"/>
+        </w:rPr>
+      </w:pPr>
+    </w:p>
+    <w:p>
+      <w:pPr>
+        <w:jc w:val="center"/>
+        <w:rPr>
+          <w:rFonts w:ascii="Times New Roman" w:hAnsi="Times New Roman"/>
+          <w:sz w:val="24"/>
+        </w:rPr>
+      </w:pPr>
+      <w:r>
+        <w:rPr>
+          <w:rFonts w:ascii="Times New Roman" w:hAnsi="Times New Roman"/>
+          <w:sz w:val="24"/>
+        </w:rPr>
+        <w:t>График курсового проектирования выполнен</w:t>
+      </w:r>
+    </w:p>
+    <w:p>
+      <w:pPr>
+        <w:rPr>
+          <w:rFonts w:ascii="Times New Roman" w:hAnsi="Times New Roman"/>
+          <w:sz w:val="2"/>
+          <w:szCs w:val="2"/>
+        </w:rPr>
+      </w:pPr>
+      <w:r>
+        <w:rPr>
+          <w:rFonts w:ascii="Times New Roman" w:hAnsi="Times New Roman"/>
+          <w:sz w:val="24"/>
+        </w:rPr>
+        <w:t>без отклонений / с незначительными отклонениями / со значительными отклонениями</w:t>
+      </w:r>
+      <w:r>
+        <w:rPr>
+          <w:rFonts w:ascii="Times New Roman" w:hAnsi="Times New Roman"/>
+          <w:sz w:val="24"/>
+        </w:rPr>
+        <w:br w:type="textWrapping"/>
+      </w:r>
+    </w:p>
+    <w:p>
+      <w:pPr>
+        <w:jc w:val="center"/>
+        <w:rPr>
+          <w:rFonts w:ascii="Times New Roman" w:hAnsi="Times New Roman"/>
+          <w:szCs w:val="16"/>
+        </w:rPr>
+      </w:pPr>
+      <w:r>
+        <w:rPr>
+          <w:rFonts w:ascii="Times New Roman" w:hAnsi="Times New Roman"/>
+          <w:sz w:val="24"/>
+        </w:rPr>
+        <w:t xml:space="preserve"> </w:t>
+      </w:r>
+      <w:r>
+        <w:rPr>
+          <w:rFonts w:ascii="Times New Roman" w:hAnsi="Times New Roman"/>
+          <w:szCs w:val="16"/>
+        </w:rPr>
+        <w:t xml:space="preserve">нужное подчеркнуть </w:t>
+      </w:r>
+    </w:p>
+    <w:p>
+      <w:pPr>
+        <w:rPr>
+          <w:rFonts w:ascii="Times New Roman" w:hAnsi="Times New Roman"/>
+          <w:sz w:val="24"/>
+        </w:rPr>
+      </w:pPr>
+    </w:p>
+    <w:p>
+      <w:pPr>
+        <w:pStyle w:val="87"/>
+      </w:pPr>
+      <w:r>
+        <w:t>Руководитель курсового проекта ___________________________ Кузнецова В.Ю.</w:t>
+      </w:r>
+    </w:p>
+    <w:p>
+      <w:pPr>
+        <w:pStyle w:val="99"/>
+        <w:pageBreakBefore/>
+        <w:tabs>
+          <w:tab w:val="right" w:leader="dot" w:pos="9689"/>
+        </w:tabs>
+      </w:pPr>
+      <w:bookmarkStart w:id="0" w:name="_Toc199359343"/>
+      <w:bookmarkStart w:id="1" w:name="_Toc199416742"/>
+      <w:bookmarkStart w:id="2" w:name="_Toc199417160"/>
+      <w:bookmarkStart w:id="3" w:name="_Toc199404571"/>
+      <w:bookmarkStart w:id="4" w:name="_Toc199696944"/>
+      <w:bookmarkStart w:id="5" w:name="_Toc199417019"/>
+      <w:r>
+        <w:t>Содержание</w:t>
+      </w:r>
+      <w:bookmarkEnd w:id="0"/>
+      <w:bookmarkEnd w:id="1"/>
+      <w:bookmarkEnd w:id="2"/>
+      <w:bookmarkEnd w:id="3"/>
+      <w:bookmarkEnd w:id="4"/>
+      <w:bookmarkEnd w:id="5"/>
+    </w:p>
+    <w:sdt>
+      <w:sdtPr>
+        <w:rPr>
+          <w:rFonts w:ascii="Verdana" w:hAnsi="Verdana" w:eastAsia="Calibri" w:cs="Times New Roman"/>
+          <w:color w:val="auto"/>
+          <w:sz w:val="16"/>
+          <w:szCs w:val="24"/>
+          <w:lang w:eastAsia="en-US"/>
+        </w:rPr>
+        <w:id w:val="-1615125031"/>
+        <w:docPartObj>
+          <w:docPartGallery w:val="Table of Contents"/>
+          <w:docPartUnique/>
+        </w:docPartObj>
+      </w:sdtPr>
+      <w:sdtEndPr>
+        <w:rPr>
+          <w:rFonts w:ascii="Verdana" w:hAnsi="Verdana" w:eastAsia="Calibri" w:cs="Times New Roman"/>
+          <w:b/>
+          <w:bCs/>
+          <w:color w:val="auto"/>
+          <w:sz w:val="16"/>
+          <w:szCs w:val="24"/>
+          <w:lang w:eastAsia="en-US"/>
+        </w:rPr>
+      </w:sdtEndPr>
+      <w:sdtContent/>
+    </w:sdt>
+    <w:p/>
+    <w:p/>
+    <w:p>
+      <w:pPr>
+        <w:spacing w:line="360" w:lineRule="auto"/>
+        <w:rPr>
+          <w:rFonts w:ascii="Times New Roman" w:hAnsi="Times New Roman"/>
+          <w:b/>
+          <w:sz w:val="28"/>
+          <w:szCs w:val="28"/>
+        </w:rPr>
+        <w:sectPr>
+          <w:pgSz w:w="11906" w:h="16838"/>
+          <w:pgMar w:top="1418" w:right="851" w:bottom="851" w:left="1134" w:header="567" w:footer="0" w:gutter="0"/>
+          <w:cols w:space="720" w:num="1"/>
+          <w:titlePg/>
+          <w:docGrid w:linePitch="360" w:charSpace="0"/>
+        </w:sectPr>
+      </w:pPr>
+    </w:p>
     <w:sectPr>
       <w:headerReference r:id="rId4" w:type="default"/>
-      <w:headerReference w:type="first" r:id="rId31"/>
-      <w:headerReference w:type="even" r:id="rId32"/>
-      <w:footerReference w:type="default" r:id="rId33"/>
-      <w:footerReference w:type="first" r:id="rId34"/>
-      <w:footerReference w:type="even" r:id="rId35"/>
       <w:pgSz w:w="11906" w:h="16838"/>
       <w:pgMar w:top="1418" w:right="851" w:bottom="851" w:left="1134" w:header="709" w:footer="0" w:gutter="0"/>
       <w:cols w:space="720" w:num="1"/>
@@ -16,24 +3776,6 @@
     </w:sectPr>
   </w:body>
 </w:document>
-</file>
-
-<file path=word/footer1.xml><?xml version="1.0" encoding="utf-8"?>
-<w:ftr xmlns:m="http://schemas.openxmlformats.org/officeDocument/2006/math" xmlns:mc="http://schemas.openxmlformats.org/markup-compatibility/2006" xmlns:mo="http://schemas.microsoft.com/office/mac/office/2008/main" xmlns:mv="urn:schemas-microsoft-com:mac:vml" xmlns:o="urn:schemas-microsoft-com:office:office" xmlns:r="http://schemas.openxmlformats.org/officeDocument/2006/relationships" xmlns:v="urn:schemas-microsoft-com:vml" xmlns:w10="urn:schemas-microsoft-com:office:word" xmlns:w14="http://schemas.microsoft.com/office/word/2010/wordml" xmlns:w="http://schemas.openxmlformats.org/wordprocessingml/2006/main" xmlns:wne="http://schemas.microsoft.com/office/word/2006/wordml" xmlns:wp14="http://schemas.microsoft.com/office/word/2010/wordprocessingDrawing" xmlns:wp="http://schemas.openxmlformats.org/drawingml/2006/wordprocessingDrawing" xmlns:wpc="http://schemas.microsoft.com/office/word/2010/wordprocessingCanvas" xmlns:wpg="http://schemas.microsoft.com/office/word/2010/wordprocessingGroup" xmlns:wpi="http://schemas.microsoft.com/office/word/2010/wordprocessingInk" xmlns:wps="http://schemas.microsoft.com/office/word/2010/wordprocessingShape" mc:Ignorable="w14 wp14">
-  <w:p/>
-</w:ftr>
-</file>
-
-<file path=word/footer2.xml><?xml version="1.0" encoding="utf-8"?>
-<w:ftr xmlns:m="http://schemas.openxmlformats.org/officeDocument/2006/math" xmlns:mc="http://schemas.openxmlformats.org/markup-compatibility/2006" xmlns:mo="http://schemas.microsoft.com/office/mac/office/2008/main" xmlns:mv="urn:schemas-microsoft-com:mac:vml" xmlns:o="urn:schemas-microsoft-com:office:office" xmlns:r="http://schemas.openxmlformats.org/officeDocument/2006/relationships" xmlns:v="urn:schemas-microsoft-com:vml" xmlns:w10="urn:schemas-microsoft-com:office:word" xmlns:w14="http://schemas.microsoft.com/office/word/2010/wordml" xmlns:w="http://schemas.openxmlformats.org/wordprocessingml/2006/main" xmlns:wne="http://schemas.microsoft.com/office/word/2006/wordml" xmlns:wp14="http://schemas.microsoft.com/office/word/2010/wordprocessingDrawing" xmlns:wp="http://schemas.openxmlformats.org/drawingml/2006/wordprocessingDrawing" xmlns:wpc="http://schemas.microsoft.com/office/word/2010/wordprocessingCanvas" xmlns:wpg="http://schemas.microsoft.com/office/word/2010/wordprocessingGroup" xmlns:wpi="http://schemas.microsoft.com/office/word/2010/wordprocessingInk" xmlns:wps="http://schemas.microsoft.com/office/word/2010/wordprocessingShape" mc:Ignorable="w14 wp14">
-  <w:p/>
-</w:ftr>
-</file>
-
-<file path=word/footer3.xml><?xml version="1.0" encoding="utf-8"?>
-<w:ftr xmlns:m="http://schemas.openxmlformats.org/officeDocument/2006/math" xmlns:mc="http://schemas.openxmlformats.org/markup-compatibility/2006" xmlns:mo="http://schemas.microsoft.com/office/mac/office/2008/main" xmlns:mv="urn:schemas-microsoft-com:mac:vml" xmlns:o="urn:schemas-microsoft-com:office:office" xmlns:r="http://schemas.openxmlformats.org/officeDocument/2006/relationships" xmlns:v="urn:schemas-microsoft-com:vml" xmlns:w10="urn:schemas-microsoft-com:office:word" xmlns:w14="http://schemas.microsoft.com/office/word/2010/wordml" xmlns:w="http://schemas.openxmlformats.org/wordprocessingml/2006/main" xmlns:wne="http://schemas.microsoft.com/office/word/2006/wordml" xmlns:wp14="http://schemas.microsoft.com/office/word/2010/wordprocessingDrawing" xmlns:wp="http://schemas.openxmlformats.org/drawingml/2006/wordprocessingDrawing" xmlns:wpc="http://schemas.microsoft.com/office/word/2010/wordprocessingCanvas" xmlns:wpg="http://schemas.microsoft.com/office/word/2010/wordprocessingGroup" xmlns:wpi="http://schemas.microsoft.com/office/word/2010/wordprocessingInk" xmlns:wps="http://schemas.microsoft.com/office/word/2010/wordprocessingShape" mc:Ignorable="w14 wp14">
-  <w:p/>
-</w:ftr>
 </file>
 
 <file path=word/header1.xml><?xml version="1.0" encoding="utf-8"?>
@@ -77,19 +3819,160 @@
 
 <file path=word/header2.xml><?xml version="1.0" encoding="utf-8"?>
 <w:hdr xmlns:wpc="http://schemas.microsoft.com/office/word/2010/wordprocessingCanvas" xmlns:mc="http://schemas.openxmlformats.org/markup-compatibility/2006" xmlns:o="urn:schemas-microsoft-com:office:office" xmlns:r="http://schemas.openxmlformats.org/officeDocument/2006/relationships" xmlns:m="http://schemas.openxmlformats.org/officeDocument/2006/math" xmlns:v="urn:schemas-microsoft-com:vml" xmlns:wp14="http://schemas.microsoft.com/office/word/2010/wordprocessingDrawing" xmlns:wp="http://schemas.openxmlformats.org/drawingml/2006/wordprocessingDrawing" xmlns:w10="urn:schemas-microsoft-com:office:word" xmlns:w="http://schemas.openxmlformats.org/wordprocessingml/2006/main" xmlns:w14="http://schemas.microsoft.com/office/word/2010/wordml" xmlns:w15="http://schemas.microsoft.com/office/word/2012/wordml" xmlns:wpg="http://schemas.microsoft.com/office/word/2010/wordprocessingGroup" xmlns:wpi="http://schemas.microsoft.com/office/word/2010/wordprocessingInk" xmlns:wne="http://schemas.microsoft.com/office/word/2006/wordml" xmlns:wps="http://schemas.microsoft.com/office/word/2010/wordprocessingShape" xmlns:wpsCustomData="http://www.wps.cn/officeDocument/2013/wpsCustomData" mc:Ignorable="w14 w15 wp14">
-  <w:p/>
-</w:hdr>
-</file>
-
-<file path=word/header3.xml><?xml version="1.0" encoding="utf-8"?>
-<w:hdr xmlns:m="http://schemas.openxmlformats.org/officeDocument/2006/math" xmlns:mc="http://schemas.openxmlformats.org/markup-compatibility/2006" xmlns:mo="http://schemas.microsoft.com/office/mac/office/2008/main" xmlns:mv="urn:schemas-microsoft-com:mac:vml" xmlns:o="urn:schemas-microsoft-com:office:office" xmlns:r="http://schemas.openxmlformats.org/officeDocument/2006/relationships" xmlns:v="urn:schemas-microsoft-com:vml" xmlns:w10="urn:schemas-microsoft-com:office:word" xmlns:w14="http://schemas.microsoft.com/office/word/2010/wordml" xmlns:w="http://schemas.openxmlformats.org/wordprocessingml/2006/main" xmlns:wne="http://schemas.microsoft.com/office/word/2006/wordml" xmlns:wp14="http://schemas.microsoft.com/office/word/2010/wordprocessingDrawing" xmlns:wp="http://schemas.openxmlformats.org/drawingml/2006/wordprocessingDrawing" xmlns:wpc="http://schemas.microsoft.com/office/word/2010/wordprocessingCanvas" xmlns:wpg="http://schemas.microsoft.com/office/word/2010/wordprocessingGroup" xmlns:wpi="http://schemas.microsoft.com/office/word/2010/wordprocessingInk" xmlns:wps="http://schemas.microsoft.com/office/word/2010/wordprocessingShape" mc:Ignorable="w14 wp14">
-  <w:p/>
-</w:hdr>
-</file>
-
-<file path=word/header4.xml><?xml version="1.0" encoding="utf-8"?>
-<w:hdr xmlns:m="http://schemas.openxmlformats.org/officeDocument/2006/math" xmlns:mc="http://schemas.openxmlformats.org/markup-compatibility/2006" xmlns:mo="http://schemas.microsoft.com/office/mac/office/2008/main" xmlns:mv="urn:schemas-microsoft-com:mac:vml" xmlns:o="urn:schemas-microsoft-com:office:office" xmlns:r="http://schemas.openxmlformats.org/officeDocument/2006/relationships" xmlns:v="urn:schemas-microsoft-com:vml" xmlns:w10="urn:schemas-microsoft-com:office:word" xmlns:w14="http://schemas.microsoft.com/office/word/2010/wordml" xmlns:w="http://schemas.openxmlformats.org/wordprocessingml/2006/main" xmlns:wne="http://schemas.microsoft.com/office/word/2006/wordml" xmlns:wp14="http://schemas.microsoft.com/office/word/2010/wordprocessingDrawing" xmlns:wp="http://schemas.openxmlformats.org/drawingml/2006/wordprocessingDrawing" xmlns:wpc="http://schemas.microsoft.com/office/word/2010/wordprocessingCanvas" xmlns:wpg="http://schemas.microsoft.com/office/word/2010/wordprocessingGroup" xmlns:wpi="http://schemas.microsoft.com/office/word/2010/wordprocessingInk" xmlns:wps="http://schemas.microsoft.com/office/word/2010/wordprocessingShape" mc:Ignorable="w14 wp14">
-  <w:p/>
+  <w:p>
+    <w:pPr>
+      <w:pStyle w:val="23"/>
+      <w:framePr w:w="510" w:wrap="around" w:vAnchor="text" w:hAnchor="page" w:x="5866" w:y="26"/>
+      <w:ind w:firstLine="0"/>
+      <w:jc w:val="left"/>
+      <w:rPr>
+        <w:rStyle w:val="14"/>
+        <w:rFonts w:eastAsia="Calibri"/>
+        <w:sz w:val="22"/>
+        <w:szCs w:val="22"/>
+      </w:rPr>
+    </w:pPr>
+    <w:r>
+      <w:rPr>
+        <w:rFonts w:eastAsia="Calibri"/>
+        <w:sz w:val="22"/>
+        <w:szCs w:val="22"/>
+      </w:rPr>
+      <w:fldChar w:fldCharType="begin"/>
+    </w:r>
+    <w:r>
+      <w:rPr>
+        <w:rStyle w:val="14"/>
+        <w:rFonts w:eastAsia="Calibri"/>
+        <w:sz w:val="22"/>
+        <w:szCs w:val="22"/>
+      </w:rPr>
+      <w:instrText xml:space="preserve">PAGE  </w:instrText>
+    </w:r>
+    <w:r>
+      <w:rPr>
+        <w:rFonts w:eastAsia="Calibri"/>
+        <w:sz w:val="22"/>
+        <w:szCs w:val="22"/>
+      </w:rPr>
+      <w:fldChar w:fldCharType="separate"/>
+    </w:r>
+    <w:r>
+      <w:rPr>
+        <w:rStyle w:val="14"/>
+        <w:rFonts w:eastAsia="Calibri"/>
+        <w:sz w:val="22"/>
+        <w:szCs w:val="22"/>
+      </w:rPr>
+      <w:t>52</w:t>
+    </w:r>
+    <w:r>
+      <w:rPr>
+        <w:rFonts w:eastAsia="Calibri"/>
+        <w:sz w:val="22"/>
+        <w:szCs w:val="22"/>
+      </w:rPr>
+      <w:fldChar w:fldCharType="end"/>
+    </w:r>
+  </w:p>
+  <w:p>
+    <w:pPr>
+      <w:pStyle w:val="23"/>
+      <w:spacing w:line="360" w:lineRule="auto"/>
+      <w:ind w:firstLine="0"/>
+      <w:jc w:val="left"/>
+    </w:pPr>
+  </w:p>
+  <w:p>
+    <w:pPr>
+      <w:pStyle w:val="23"/>
+      <w:spacing w:line="360" w:lineRule="auto"/>
+      <w:ind w:firstLine="0"/>
+      <w:jc w:val="left"/>
+      <w:rPr>
+        <w:i/>
+        <w:color w:val="000000"/>
+        <w:u w:val="single"/>
+        <w:lang w:val="ru-RU"/>
+      </w:rPr>
+    </w:pPr>
+    <w:r>
+      <w:rPr>
+        <w:i/>
+        <w:u w:val="single"/>
+      </w:rPr>
+      <w:t>Кафедра АСОИУ</w:t>
+    </w:r>
+    <w:r>
+      <w:rPr>
+        <w:i/>
+        <w:u w:val="single"/>
+        <w:lang w:val="ru-RU"/>
+      </w:rPr>
+      <w:t xml:space="preserve"> </w:t>
+    </w:r>
+    <w:r>
+      <w:rPr>
+        <w:i/>
+        <w:u w:val="single"/>
+      </w:rPr>
+      <w:t>09.03.0</w:t>
+    </w:r>
+    <w:r>
+      <w:rPr>
+        <w:i/>
+        <w:u w:val="single"/>
+        <w:lang w:val="ru-RU"/>
+      </w:rPr>
+      <w:t xml:space="preserve">1                           </w:t>
+    </w:r>
+    <w:r>
+      <w:rPr>
+        <w:i/>
+        <w:u w:val="single"/>
+      </w:rPr>
+      <w:t> </w:t>
+    </w:r>
+    <w:r>
+      <w:rPr>
+        <w:i/>
+        <w:u w:val="single"/>
+        <w:lang w:val="ru-RU"/>
+      </w:rPr>
+      <w:t xml:space="preserve">Разработка профессиональных приложений </w:t>
+    </w:r>
+    <w:r>
+      <w:rPr>
+        <w:i/>
+        <w:u w:val="single"/>
+      </w:rPr>
+      <w:t>К</w:t>
+    </w:r>
+    <w:r>
+      <w:rPr>
+        <w:i/>
+        <w:u w:val="single"/>
+        <w:lang w:val="ru-RU"/>
+      </w:rPr>
+      <w:t>П</w:t>
+    </w:r>
+    <w:r>
+      <w:rPr>
+        <w:i/>
+        <w:u w:val="single"/>
+      </w:rPr>
+      <w:t> </w:t>
+    </w:r>
+    <w:r>
+      <w:rPr>
+        <w:i/>
+        <w:color w:val="000000"/>
+        <w:u w:val="single"/>
+        <w:lang w:val="ru-RU"/>
+      </w:rPr>
+      <w:t>232116</w:t>
+    </w:r>
+  </w:p>
 </w:hdr>
 </file>
 

</xml_diff>